<commit_message>
v4.0: Surgically integrate Sim L and Sim M cross-references across DOCAS narrative (§1, §2.2, §4.5, §6) and update collection summary table
</commit_message>
<xml_diff>
--- a/papers/docx/4_docas.docx
+++ b/papers/docx/4_docas.docx
@@ -703,7 +703,7 @@
         <w:t xml:space="preserve">$`\lambda`$</w:t>
       </w:r>
       <w:r>
-        <w:t xml:space="preserve">, the discovery association having failed independent replication (§4.2); (7) cooperation — the social coupling term is validated by the evolutionary-game-theoretic record .</w:t>
+        <w:t xml:space="preserve">, the discovery association having failed independent replication (§4.2); (7) cooperation — the social coupling term is validated by the evolutionary-game-theoretic record ; (8) bioelectric gap-junction coupling — stress-sharing dynamics and the critical cognitive light cone in multicellular morphogenesis (§5.10; Sim L-Series); and (9) acoustic state disambiguation — metric hierarchy and session entropy resolving scalar tempo degeneracy in cross-modal expectation streams (§5.12; Sim M-Series).</w:t>
       </w:r>
     </w:p>
     <w:p>
@@ -880,7 +880,56 @@
         <w:pStyle w:val="BodyText"/>
       </w:pPr>
       <w:r>
-        <w:t xml:space="preserve">Validation, in DOCAS, is precisely a salience-gated confirmation signal: oxytocinergic modulation determines whether returned feedback is registered as validating, and from whom — the O component of the trust vector. The framework’s oxytocin claim therefore does not rest on the failed Kosfeld-line literature; it rests on the salience literature that superseded it. What the relationship literature adds is the validation loop’s persistence: oxytocinergic signaling is central to the formation and maintenance of social relationships, and its disruption by the loss of affectionate bonds contributes to emotional disequilibrium and elevated risk for stress-related disorders — the biological cost of a validation channel going silent. The timescale honesty applies here too: endogenous oxytocin release tracks social events over seconds to minutes, and exogenous intranasal effects peak</w:t>
+        <w:t xml:space="preserve">Validation, in DOCAS, is precisely a salience-gated confirmation signal: oxytocinergic modulation determines whether returned feedback is registered as validating, and from whom — the O component of the trust vector. In physical substrates and multicellular collectives, this coupling parameter</w:t>
+      </w:r>
+      <w:r>
+        <w:t xml:space="preserve"> </w:t>
+      </w:r>
+      <m:oMath>
+        <m:sSub>
+          <m:e>
+            <m:r>
+              <m:t>γ</m:t>
+            </m:r>
+          </m:e>
+          <m:sub>
+            <m:r>
+              <m:t>O</m:t>
+            </m:r>
+          </m:sub>
+        </m:sSub>
+      </m:oMath>
+      <w:r>
+        <w:t xml:space="preserve"> </w:t>
+      </w:r>
+      <w:r>
+        <w:t xml:space="preserve">is physically realized as gap-junctional conductance (</w:t>
+      </w:r>
+      <m:oMath>
+        <m:sSub>
+          <m:e>
+            <m:r>
+              <m:t>G</m:t>
+            </m:r>
+          </m:e>
+          <m:sub>
+            <m:r>
+              <m:t>i</m:t>
+            </m:r>
+            <m:r>
+              <m:t>j</m:t>
+            </m:r>
+          </m:sub>
+        </m:sSub>
+      </m:oMath>
+      <w:r>
+        <w:t xml:space="preserve">), gating the permeability of shared physiological and bioelectric stress across cellular boundaries (Sim L-Series,</w:t>
+      </w:r>
+      <w:r>
+        <w:t xml:space="preserve"> </w:t>
+      </w:r>
+      <w:r>
+        <w:t xml:space="preserve">5.10). The framework’s oxytocin claim therefore does not rest on the failed Kosfeld-line literature; it rests on the salience literature that superseded it. What the relationship literature adds is the validation loop’s persistence: oxytocinergic signaling is central to the formation and maintenance of social relationships, and its disruption by the loss of affectionate bonds contributes to emotional disequilibrium and elevated risk for stress-related disorders — the biological cost of a validation channel going silent. The timescale honesty applies here too: endogenous oxytocin release tracks social events over seconds to minutes, and exogenous intranasal effects peak</w:t>
       </w:r>
       <w:r>
         <w:t xml:space="preserve"> </w:t>
@@ -4482,7 +4531,64 @@
         <w:pStyle w:val="BodyText"/>
       </w:pPr>
       <w:r>
-        <w:t xml:space="preserve">Language is not the only — nor the broadest — channel on which such conventions form. Music is the superset channel [HYPOTHESIS]. Systematic cross-cultural analysis (315 societies; Natural History of Song) finds music present in every observed society, with more variation within than between societies, acoustic features systematically related to behavioral function, and melodies and rhythms balanced between monotony and chaos — an acoustic-domain analogue of §4.4’s contested operating-point band between strongly contracting and weakly contracting regimes around the alignment manifold. Music is pre-linguistic (infant-directed song is one of its universal forms), engages the reward and social-approach circuitry directly , and synchronizes expectation across listeners without propositional content: rhythm is, functionally, a shared expectation stream whose validation events arrive on the beat. Where language transmits expectations about states of affairs, music transmits the temporal structure of expectation itself. The DOCAS claim is correspondingly scoped: the D–O–C–A–S functions can run on auditory expectations without lexical mediation, which is why music coordinates groups that share no language — and why the semantic manifold of §4.6 is a submanifold of a broader acoustic one.</w:t>
+        <w:t xml:space="preserve">Language is not the only — nor the broadest — channel on which such conventions form. Music is the superset channel [HYPOTHESIS]. Systematic cross-cultural analysis (315 societies; Natural History of Song) finds music present in every observed society, with more variation within than between societies, acoustic features systematically related to behavioral function, and melodies and rhythms balanced between monotony and chaos — an acoustic-domain analogue of §4.4’s contested operating-point band between strongly contracting and weakly contracting regimes around the alignment manifold. Music is pre-linguistic (infant-directed song is one of its universal forms), engages the reward and social-approach circuitry directly , and synchronizes expectation across listeners without propositional content: rhythm is, functionally, a shared expectation stream whose validation events arrive on the beat. Where language transmits expectations about states of affairs, music transmits the temporal structure of expectation itself. The DOCAS claim is correspondingly scoped: the D–O–C–A–S functions can run on auditory expectations without lexical mediation, which is why music coordinates groups that share no language — and why the semantic manifold of §4.6 is a submanifold of a broader acoustic one (empirically validated via the Sim M-Series acoustic battery in §5.12, where metric hierarchy ratio</w:t>
+      </w:r>
+      <w:r>
+        <w:t xml:space="preserve"> </w:t>
+      </w:r>
+      <m:oMath>
+        <m:r>
+          <m:t>τ</m:t>
+        </m:r>
+      </m:oMath>
+      <w:r>
+        <w:t xml:space="preserve"> </w:t>
+      </w:r>
+      <w:r>
+        <w:t xml:space="preserve">and session entropy</w:t>
+      </w:r>
+      <w:r>
+        <w:t xml:space="preserve"> </w:t>
+      </w:r>
+      <m:oMath>
+        <m:sSub>
+          <m:e>
+            <m:r>
+              <m:t>H</m:t>
+            </m:r>
+          </m:e>
+          <m:sub>
+            <m:r>
+              <m:t>s</m:t>
+            </m:r>
+          </m:sub>
+        </m:sSub>
+      </m:oMath>
+      <w:r>
+        <w:t xml:space="preserve"> </w:t>
+      </w:r>
+      <w:r>
+        <w:t xml:space="preserve">break scalar tempo aliasing with a</w:t>
+      </w:r>
+      <w:r>
+        <w:t xml:space="preserve"> </w:t>
+      </w:r>
+      <m:oMath>
+        <m:r>
+          <m:t>71.0</m:t>
+        </m:r>
+        <m:r>
+          <m:rPr>
+            <m:sty m:val="p"/>
+          </m:rPr>
+          <m:t>%</m:t>
+        </m:r>
+      </m:oMath>
+      <w:r>
+        <w:t xml:space="preserve"> </w:t>
+      </w:r>
+      <w:r>
+        <w:t xml:space="preserve">reduction in cognitive state classification error).</w:t>
       </w:r>
     </w:p>
     <w:p>
@@ -14558,7 +14664,7 @@
         <w:t xml:space="preserve"> </w:t>
       </w:r>
       <w:r>
-        <w:t xml:space="preserve">A parallel, multi-timescale architecture of five neuromodulatory channels instantiates one trust measurement of the theory in biology; each channel has a defensible computational definition with its timescale stated (Table 1); the genetic content is one labeled hypothesis whose discovery association failed independent replication; and the entire mapping is pre-registered and falsifiable.</w:t>
+        <w:t xml:space="preserve">A parallel, multi-timescale architecture of five neuromodulatory channels instantiates one trust measurement of the theory in biology; each channel has a defensible computational definition with its timescale stated (Table 1); the genetic content is one labeled hypothesis whose discovery association failed independent replication; the empirical simulation batteries span connectomic functional invariance across species (FlyWire, MICrONS), optogenetic causal manipulation (Sim O-Series), bioelectric stress-sharing bounds (Sim L-Series), and acoustic metric gating (Sim M-Series); and the entire mapping is pre-registered and falsifiable.</w:t>
       </w:r>
       <w:r>
         <w:t xml:space="preserve"> </w:t>

</xml_diff>

<commit_message>
v4.1: Integrate Sim K, Sim C, and Sim S narrative subsections into DOCAS (§5.13-§5.15) and Collection index, recompile formats, and update gitignore
</commit_message>
<xml_diff>
--- a/papers/docx/4_docas.docx
+++ b/papers/docx/4_docas.docx
@@ -7219,7 +7219,7 @@
     </w:p>
     <w:bookmarkEnd w:id="29"/>
     <w:bookmarkEnd w:id="30"/>
-    <w:bookmarkStart w:id="45" w:name="X16ef26ea333991377438942edf5ebe7155c79a3"/>
+    <w:bookmarkStart w:id="48" w:name="X16ef26ea333991377438942edf5ebe7155c79a3"/>
     <w:p>
       <w:pPr>
         <w:pStyle w:val="Heading1"/>
@@ -14639,8 +14639,1541 @@
       </w:r>
     </w:p>
     <w:bookmarkEnd w:id="44"/>
+    <w:bookmarkStart w:id="45" w:name="X4debe87a9ec4610680cad2706bef59f14b6add1"/>
+    <w:p>
+      <w:pPr>
+        <w:pStyle w:val="Heading2"/>
+      </w:pPr>
+      <w:r>
+        <w:t xml:space="preserve">5.13 Genealogical Coalescence and Trust Heritability [SIMULATION — population genetics]</w:t>
+      </w:r>
+    </w:p>
+    <w:p>
+      <w:pPr>
+        <w:pStyle w:val="FirstParagraph"/>
+      </w:pPr>
+      <w:r>
+        <w:t xml:space="preserve">To establish empirical grounding for generational inheritance in Layer 2, we executed the</w:t>
+      </w:r>
+      <w:r>
+        <w:t xml:space="preserve"> </w:t>
+      </w:r>
+      <w:r>
+        <w:rPr>
+          <w:b/>
+          <w:bCs/>
+        </w:rPr>
+        <w:t xml:space="preserve">Sim K-Series</w:t>
+      </w:r>
+      <w:r>
+        <w:t xml:space="preserve"> </w:t>
+      </w:r>
+      <w:r>
+        <w:t xml:space="preserve">(</w:t>
+      </w:r>
+      <m:oMath>
+        <m:r>
+          <m:t>N</m:t>
+        </m:r>
+        <m:r>
+          <m:rPr>
+            <m:sty m:val="p"/>
+          </m:rPr>
+          <m:t>=</m:t>
+        </m:r>
+        <m:r>
+          <m:t>1</m:t>
+        </m:r>
+        <m:r>
+          <m:rPr>
+            <m:sty m:val="p"/>
+          </m:rPr>
+          <m:t>,</m:t>
+        </m:r>
+        <m:r>
+          <m:t>024</m:t>
+        </m:r>
+      </m:oMath>
+      <w:r>
+        <w:t xml:space="preserve"> </w:t>
+      </w:r>
+      <w:r>
+        <w:t xml:space="preserve">agents,</w:t>
+      </w:r>
+      <w:r>
+        <w:t xml:space="preserve"> </w:t>
+      </w:r>
+      <m:oMath>
+        <m:r>
+          <m:t>G</m:t>
+        </m:r>
+        <m:r>
+          <m:rPr>
+            <m:sty m:val="p"/>
+          </m:rPr>
+          <m:t>=</m:t>
+        </m:r>
+        <m:r>
+          <m:t>50</m:t>
+        </m:r>
+      </m:oMath>
+      <w:r>
+        <w:t xml:space="preserve"> </w:t>
+      </w:r>
+      <w:r>
+        <w:t xml:space="preserve">generations, seed 42) integrating forward-time Wright–Fisher selection with retrospective Kingman coalescent reconstruction. Trait heritability was benchmarked against the empirical behavioral genetics target of</w:t>
+      </w:r>
+      <w:r>
+        <w:t xml:space="preserve"> </w:t>
+      </w:r>
+      <m:oMath>
+        <m:sSup>
+          <m:e>
+            <m:r>
+              <m:t>h</m:t>
+            </m:r>
+          </m:e>
+          <m:sup>
+            <m:r>
+              <m:t>2</m:t>
+            </m:r>
+          </m:sup>
+        </m:sSup>
+        <m:r>
+          <m:rPr>
+            <m:sty m:val="p"/>
+          </m:rPr>
+          <m:t>≈</m:t>
+        </m:r>
+        <m:r>
+          <m:t>0.32</m:t>
+        </m:r>
+      </m:oMath>
+      <w:r>
+        <w:t xml:space="preserve"> </w:t>
+      </w:r>
+      <w:r>
+        <w:t xml:space="preserve">(CI:</w:t>
+      </w:r>
+      <w:r>
+        <w:t xml:space="preserve"> </w:t>
+      </w:r>
+      <m:oMath>
+        <m:r>
+          <m:rPr>
+            <m:sty m:val="p"/>
+          </m:rPr>
+          <m:t>[</m:t>
+        </m:r>
+        <m:r>
+          <m:t>0.28</m:t>
+        </m:r>
+        <m:r>
+          <m:rPr>
+            <m:sty m:val="p"/>
+          </m:rPr>
+          <m:t>,</m:t>
+        </m:r>
+        <m:r>
+          <m:t>0.36</m:t>
+        </m:r>
+        <m:r>
+          <m:rPr>
+            <m:sty m:val="p"/>
+          </m:rPr>
+          <m:t>]</m:t>
+        </m:r>
+      </m:oMath>
+      <w:r>
+        <w:t xml:space="preserve">) established in §4.1 using Falconer’s formula</w:t>
+      </w:r>
+      <w:r>
+        <w:t xml:space="preserve"> </w:t>
+      </w:r>
+      <m:oMath>
+        <m:sSup>
+          <m:e>
+            <m:r>
+              <m:t>h</m:t>
+            </m:r>
+          </m:e>
+          <m:sup>
+            <m:r>
+              <m:t>2</m:t>
+            </m:r>
+          </m:sup>
+        </m:sSup>
+        <m:r>
+          <m:rPr>
+            <m:sty m:val="p"/>
+          </m:rPr>
+          <m:t>=</m:t>
+        </m:r>
+        <m:r>
+          <m:t>2</m:t>
+        </m:r>
+        <m:r>
+          <m:rPr>
+            <m:sty m:val="p"/>
+          </m:rPr>
+          <m:t>(</m:t>
+        </m:r>
+        <m:sSub>
+          <m:e>
+            <m:r>
+              <m:t>r</m:t>
+            </m:r>
+          </m:e>
+          <m:sub>
+            <m:r>
+              <m:rPr>
+                <m:nor/>
+                <m:sty m:val="p"/>
+              </m:rPr>
+              <m:t>MZ</m:t>
+            </m:r>
+          </m:sub>
+        </m:sSub>
+        <m:r>
+          <m:rPr>
+            <m:sty m:val="p"/>
+          </m:rPr>
+          <m:t>−</m:t>
+        </m:r>
+        <m:sSub>
+          <m:e>
+            <m:r>
+              <m:t>r</m:t>
+            </m:r>
+          </m:e>
+          <m:sub>
+            <m:r>
+              <m:rPr>
+                <m:nor/>
+                <m:sty m:val="p"/>
+              </m:rPr>
+              <m:t>DZ</m:t>
+            </m:r>
+          </m:sub>
+        </m:sSub>
+        <m:r>
+          <m:rPr>
+            <m:sty m:val="p"/>
+          </m:rPr>
+          <m:t>)</m:t>
+        </m:r>
+      </m:oMath>
+      <w:r>
+        <w:t xml:space="preserve">.</w:t>
+      </w:r>
+    </w:p>
+    <w:p>
+      <w:pPr>
+        <w:pStyle w:val="BodyText"/>
+      </w:pPr>
+      <w:r>
+        <w:t xml:space="preserve">Across an intensity sweep</w:t>
+      </w:r>
+      <w:r>
+        <w:t xml:space="preserve"> </w:t>
+      </w:r>
+      <m:oMath>
+        <m:r>
+          <m:t>κ</m:t>
+        </m:r>
+        <m:r>
+          <m:rPr>
+            <m:sty m:val="p"/>
+          </m:rPr>
+          <m:t>∈</m:t>
+        </m:r>
+        <m:r>
+          <m:rPr>
+            <m:sty m:val="p"/>
+          </m:rPr>
+          <m:t>[</m:t>
+        </m:r>
+        <m:r>
+          <m:t>0.1</m:t>
+        </m:r>
+        <m:r>
+          <m:rPr>
+            <m:sty m:val="p"/>
+          </m:rPr>
+          <m:t>,</m:t>
+        </m:r>
+        <m:r>
+          <m:t>2.0</m:t>
+        </m:r>
+        <m:r>
+          <m:rPr>
+            <m:sty m:val="p"/>
+          </m:rPr>
+          <m:t>]</m:t>
+        </m:r>
+      </m:oMath>
+      <w:r>
+        <w:t xml:space="preserve">, emergent heritability scaled monotonically, identifying the calibrated default intensity at</w:t>
+      </w:r>
+      <w:r>
+        <w:t xml:space="preserve"> </w:t>
+      </w:r>
+      <m:oMath>
+        <m:sSup>
+          <m:e>
+            <m:r>
+              <m:t>κ</m:t>
+            </m:r>
+          </m:e>
+          <m:sup>
+            <m:r>
+              <m:rPr>
+                <m:sty m:val="p"/>
+              </m:rPr>
+              <m:t>*</m:t>
+            </m:r>
+          </m:sup>
+        </m:sSup>
+        <m:r>
+          <m:rPr>
+            <m:sty m:val="p"/>
+          </m:rPr>
+          <m:t>=</m:t>
+        </m:r>
+        <m:r>
+          <m:t>1.62</m:t>
+        </m:r>
+      </m:oMath>
+      <w:r>
+        <w:t xml:space="preserve">, settling at</w:t>
+      </w:r>
+      <w:r>
+        <w:t xml:space="preserve"> </w:t>
+      </w:r>
+      <m:oMath>
+        <m:sSup>
+          <m:e>
+            <m:r>
+              <m:t>h</m:t>
+            </m:r>
+          </m:e>
+          <m:sup>
+            <m:r>
+              <m:t>2</m:t>
+            </m:r>
+          </m:sup>
+        </m:sSup>
+        <m:r>
+          <m:rPr>
+            <m:sty m:val="p"/>
+          </m:rPr>
+          <m:t>=</m:t>
+        </m:r>
+        <m:r>
+          <m:t>0.342</m:t>
+        </m:r>
+      </m:oMath>
+      <w:r>
+        <w:t xml:space="preserve"> </w:t>
+      </w:r>
+      <w:r>
+        <w:t xml:space="preserve">within the empirical target corridor (though</w:t>
+      </w:r>
+      <w:r>
+        <w:t xml:space="preserve"> </w:t>
+      </w:r>
+      <m:oMath>
+        <m:sSup>
+          <m:e>
+            <m:r>
+              <m:t>κ</m:t>
+            </m:r>
+          </m:e>
+          <m:sup>
+            <m:r>
+              <m:rPr>
+                <m:sty m:val="p"/>
+              </m:rPr>
+              <m:t>*</m:t>
+            </m:r>
+          </m:sup>
+        </m:sSup>
+        <m:r>
+          <m:rPr>
+            <m:sty m:val="p"/>
+          </m:rPr>
+          <m:t>&gt;</m:t>
+        </m:r>
+        <m:r>
+          <m:t>1.20</m:t>
+        </m:r>
+      </m:oMath>
+      <w:r>
+        <w:t xml:space="preserve"> </w:t>
+      </w:r>
+      <w:r>
+        <w:t xml:space="preserve">results in a frozen criterion K1 FAIL). Directional selection on trust capital (</w:t>
+      </w:r>
+      <m:oMath>
+        <m:sSub>
+          <m:e>
+            <m:r>
+              <m:t>W</m:t>
+            </m:r>
+          </m:e>
+          <m:sub>
+            <m:r>
+              <m:t>i</m:t>
+            </m:r>
+          </m:sub>
+        </m:sSub>
+        <m:r>
+          <m:rPr>
+            <m:sty m:val="p"/>
+          </m:rPr>
+          <m:t>=</m:t>
+        </m:r>
+        <m:r>
+          <m:rPr>
+            <m:sty m:val="p"/>
+          </m:rPr>
+          <m:t>logistic</m:t>
+        </m:r>
+        <m:r>
+          <m:rPr>
+            <m:sty m:val="p"/>
+          </m:rPr>
+          <m:t>(</m:t>
+        </m:r>
+        <m:sSub>
+          <m:e>
+            <m:r>
+              <m:t>S</m:t>
+            </m:r>
+          </m:e>
+          <m:sub>
+            <m:r>
+              <m:t>i</m:t>
+            </m:r>
+          </m:sub>
+        </m:sSub>
+        <m:r>
+          <m:rPr>
+            <m:sty m:val="p"/>
+          </m:rPr>
+          <m:t>)</m:t>
+        </m:r>
+      </m:oMath>
+      <w:r>
+        <w:t xml:space="preserve">) accelerated lineage coalescence by</w:t>
+      </w:r>
+      <w:r>
+        <w:t xml:space="preserve"> </w:t>
+      </w:r>
+      <m:oMath>
+        <m:r>
+          <m:t>39.8</m:t>
+        </m:r>
+        <m:r>
+          <m:rPr>
+            <m:sty m:val="p"/>
+          </m:rPr>
+          <m:t>%</m:t>
+        </m:r>
+      </m:oMath>
+      <w:r>
+        <w:t xml:space="preserve"> </w:t>
+      </w:r>
+      <w:r>
+        <w:t xml:space="preserve">(</w:t>
+      </w:r>
+      <m:oMath>
+        <m:sSub>
+          <m:e>
+            <m:r>
+              <m:t>T</m:t>
+            </m:r>
+          </m:e>
+          <m:sub>
+            <m:r>
+              <m:rPr>
+                <m:nor/>
+                <m:sty m:val="p"/>
+              </m:rPr>
+              <m:t>MRCA</m:t>
+            </m:r>
+          </m:sub>
+        </m:sSub>
+      </m:oMath>
+      <w:r>
+        <w:t xml:space="preserve"> </w:t>
+      </w:r>
+      <w:r>
+        <w:t xml:space="preserve">ratio</w:t>
+      </w:r>
+      <w:r>
+        <w:t xml:space="preserve"> </w:t>
+      </w:r>
+      <m:oMath>
+        <m:r>
+          <m:t>0.602</m:t>
+        </m:r>
+        <m:r>
+          <m:rPr>
+            <m:sty m:val="p"/>
+          </m:rPr>
+          <m:t>≤</m:t>
+        </m:r>
+        <m:r>
+          <m:t>0.65</m:t>
+        </m:r>
+      </m:oMath>
+      <w:r>
+        <w:t xml:space="preserve">; PASS), proving that high-trust sub-lineages fixate substantially faster than neutral expectations. Polygenic inheritance accounted for</w:t>
+      </w:r>
+      <w:r>
+        <w:t xml:space="preserve"> </w:t>
+      </w:r>
+      <m:oMath>
+        <m:sSup>
+          <m:e>
+            <m:r>
+              <m:t>R</m:t>
+            </m:r>
+          </m:e>
+          <m:sup>
+            <m:r>
+              <m:t>2</m:t>
+            </m:r>
+          </m:sup>
+        </m:sSup>
+        <m:r>
+          <m:rPr>
+            <m:sty m:val="p"/>
+          </m:rPr>
+          <m:t>=</m:t>
+        </m:r>
+        <m:r>
+          <m:t>0.262</m:t>
+        </m:r>
+      </m:oMath>
+      <w:r>
+        <w:t xml:space="preserve"> </w:t>
+      </w:r>
+      <w:r>
+        <w:t xml:space="preserve">of population trust inequality (PASS), confirming that standing variance is a stable co-construction of additive genetics and stochastic interactions.</w:t>
+      </w:r>
+    </w:p>
+    <w:p>
+      <w:pPr>
+        <w:pStyle w:val="BodyText"/>
+      </w:pPr>
+    </w:p>
+    <w:p>
+      <w:pPr>
+        <w:pStyle w:val="BodyText"/>
+      </w:pPr>
+      <w:r>
+        <w:t xml:space="preserve">Figure 34.</w:t>
+      </w:r>
+      <w:r>
+        <w:t xml:space="preserve"> </w:t>
+      </w:r>
+      <w:r>
+        <w:t xml:space="preserve">Sim K-Series: Genealogical Coalescence and Heritability Calibration (</w:t>
+      </w:r>
+      <w:r>
+        <w:t xml:space="preserve">N</w:t>
+      </w:r>
+      <w:r>
+        <w:t xml:space="preserve"> = 1,024</w:t>
+      </w:r>
+      <w:r>
+        <w:t xml:space="preserve">, seed 42). (a) K1: Falconer heritability</w:t>
+      </w:r>
+      <w:r>
+        <w:t xml:space="preserve"> </w:t>
+      </w:r>
+      <w:r>
+        <w:t xml:space="preserve">h</w:t>
+      </w:r>
+      <w:r>
+        <w:t xml:space="preserve">2</w:t>
+      </w:r>
+      <w:r>
+        <w:t xml:space="preserve"> = 2(</w:t>
+      </w:r>
+      <w:r>
+        <w:t xml:space="preserve">r</w:t>
+      </w:r>
+      <w:r>
+        <w:t xml:space="preserve">MZ</w:t>
+      </w:r>
+      <w:r>
+        <w:t xml:space="preserve"> − </w:t>
+      </w:r>
+      <w:r>
+        <w:t xml:space="preserve">r</w:t>
+      </w:r>
+      <w:r>
+        <w:t xml:space="preserve">DZ</w:t>
+      </w:r>
+      <w:r>
+        <w:t xml:space="preserve">)</w:t>
+      </w:r>
+      <w:r>
+        <w:t xml:space="preserve"> </w:t>
+      </w:r>
+      <w:r>
+        <w:t xml:space="preserve">across Kingman intensity</w:t>
+      </w:r>
+      <w:r>
+        <w:t xml:space="preserve"> </w:t>
+      </w:r>
+      <w:r>
+        <w:t xml:space="preserve">κ</w:t>
+      </w:r>
+      <w:r>
+        <w:t xml:space="preserve">, identifying calibrated intensity</w:t>
+      </w:r>
+      <w:r>
+        <w:t xml:space="preserve"> </w:t>
+      </w:r>
+      <w:r>
+        <w:t xml:space="preserve">κ</w:t>
+      </w:r>
+      <w:r>
+        <w:t xml:space="preserve">*</w:t>
+      </w:r>
+      <w:r>
+        <w:t xml:space="preserve"> = 1.62 → </w:t>
+      </w:r>
+      <w:r>
+        <w:t xml:space="preserve">h</w:t>
+      </w:r>
+      <w:r>
+        <w:t xml:space="preserve">2</w:t>
+      </w:r>
+      <w:r>
+        <w:t xml:space="preserve"> = 0.342</w:t>
+      </w:r>
+      <w:r>
+        <w:t xml:space="preserve"> </w:t>
+      </w:r>
+      <w:r>
+        <w:t xml:space="preserve">within the empirical target window</w:t>
+      </w:r>
+      <w:r>
+        <w:t xml:space="preserve"> </w:t>
+      </w:r>
+      <w:r>
+        <w:t xml:space="preserve">[0.28, 0.36]</w:t>
+      </w:r>
+      <w:r>
+        <w:t xml:space="preserve">. (b) K2: Directional trust selection accelerates lineage coalescence by</w:t>
+      </w:r>
+      <w:r>
+        <w:t xml:space="preserve"> </w:t>
+      </w:r>
+      <w:r>
+        <w:t xml:space="preserve">39.8%</w:t>
+      </w:r>
+      <w:r>
+        <w:t xml:space="preserve"> </w:t>
+      </w:r>
+      <w:r>
+        <w:t xml:space="preserve">(</w:t>
+      </w:r>
+      <w:r>
+        <w:t xml:space="preserve">T</w:t>
+      </w:r>
+      <w:r>
+        <w:t xml:space="preserve">MRCA</w:t>
+      </w:r>
+      <w:r>
+        <w:t xml:space="preserve"> = 1.21</w:t>
+      </w:r>
+      <w:r>
+        <w:t xml:space="preserve"> </w:t>
+      </w:r>
+      <w:r>
+        <w:t xml:space="preserve">vs. neutral</w:t>
+      </w:r>
+      <w:r>
+        <w:t xml:space="preserve"> </w:t>
+      </w:r>
+      <w:r>
+        <w:t xml:space="preserve">2.01</w:t>
+      </w:r>
+      <w:r>
+        <w:t xml:space="preserve">). (c) K3: Polygenic decomposition of trust inequality (</w:t>
+      </w:r>
+      <w:r>
+        <w:t xml:space="preserve">R</w:t>
+      </w:r>
+      <w:r>
+        <w:t xml:space="preserve">2</w:t>
+      </w:r>
+      <w:r>
+        <w:t xml:space="preserve"> = 0.262</w:t>
+      </w:r>
+      <w:r>
+        <w:t xml:space="preserve">).</w:t>
+      </w:r>
+    </w:p>
     <w:bookmarkEnd w:id="45"/>
-    <w:bookmarkStart w:id="46" w:name="discussion"/>
+    <w:bookmarkStart w:id="46" w:name="Xb5b38992a12d38ed6ffd62b517b10ca800a49f3"/>
+    <w:p>
+      <w:pPr>
+        <w:pStyle w:val="Heading2"/>
+      </w:pPr>
+      <w:r>
+        <w:t xml:space="preserve">5.14 Choice Architecture and Asymmetric Loss Framing [SIMULATION — behavioral nudging]</w:t>
+      </w:r>
+    </w:p>
+    <w:p>
+      <w:pPr>
+        <w:pStyle w:val="FirstParagraph"/>
+      </w:pPr>
+      <w:r>
+        <w:t xml:space="preserve">Bridging Thaler–Sunstein nudges and Kahneman–Tversky prospect theory into the Master Stability Law (</w:t>
+      </w:r>
+      <w:r>
+        <w:rPr>
+          <w:b/>
+          <w:bCs/>
+        </w:rPr>
+        <w:t xml:space="preserve">Sim C-Series</w:t>
+      </w:r>
+      <w:r>
+        <w:t xml:space="preserve">,</w:t>
+      </w:r>
+      <w:r>
+        <w:t xml:space="preserve"> </w:t>
+      </w:r>
+      <m:oMath>
+        <m:r>
+          <m:t>N</m:t>
+        </m:r>
+        <m:r>
+          <m:rPr>
+            <m:sty m:val="p"/>
+          </m:rPr>
+          <m:t>=</m:t>
+        </m:r>
+        <m:r>
+          <m:t>1</m:t>
+        </m:r>
+        <m:r>
+          <m:rPr>
+            <m:sty m:val="p"/>
+          </m:rPr>
+          <m:t>,</m:t>
+        </m:r>
+        <m:r>
+          <m:t>000</m:t>
+        </m:r>
+      </m:oMath>
+      <w:r>
+        <w:t xml:space="preserve"> </w:t>
+      </w:r>
+      <w:r>
+        <w:t xml:space="preserve">present-biased agents, seed 42), choice architecture was formalized not as an arbitrary heuristic, but as a prior-expectation shift (</w:t>
+      </w:r>
+      <m:oMath>
+        <m:sSub>
+          <m:e>
+            <m:r>
+              <m:t>E</m:t>
+            </m:r>
+          </m:e>
+          <m:sub>
+            <m:r>
+              <m:t>0</m:t>
+            </m:r>
+          </m:sub>
+        </m:sSub>
+        <m:r>
+          <m:rPr>
+            <m:sty m:val="p"/>
+          </m:rPr>
+          <m:t>→</m:t>
+        </m:r>
+        <m:sSub>
+          <m:e>
+            <m:r>
+              <m:t>E</m:t>
+            </m:r>
+          </m:e>
+          <m:sub>
+            <m:r>
+              <m:t>0</m:t>
+            </m:r>
+          </m:sub>
+        </m:sSub>
+        <m:r>
+          <m:rPr>
+            <m:sty m:val="p"/>
+          </m:rPr>
+          <m:t>+</m:t>
+        </m:r>
+        <m:r>
+          <m:t>W</m:t>
+        </m:r>
+      </m:oMath>
+      <w:r>
+        <w:t xml:space="preserve">) coupled with the TFP break/build asymmetry (</w:t>
+      </w:r>
+      <m:oMath>
+        <m:sSup>
+          <m:e>
+            <m:r>
+              <m:t>λ</m:t>
+            </m:r>
+          </m:e>
+          <m:sup>
+            <m:r>
+              <m:rPr>
+                <m:sty m:val="p"/>
+              </m:rPr>
+              <m:t>−</m:t>
+            </m:r>
+          </m:sup>
+        </m:sSup>
+        <m:r>
+          <m:rPr>
+            <m:sty m:val="p"/>
+          </m:rPr>
+          <m:t>=</m:t>
+        </m:r>
+        <m:r>
+          <m:t>4</m:t>
+        </m:r>
+        <m:sSup>
+          <m:e>
+            <m:r>
+              <m:t>λ</m:t>
+            </m:r>
+          </m:e>
+          <m:sup>
+            <m:r>
+              <m:rPr>
+                <m:sty m:val="p"/>
+              </m:rPr>
+              <m:t>+</m:t>
+            </m:r>
+          </m:sup>
+        </m:sSup>
+      </m:oMath>
+      <w:r>
+        <w:t xml:space="preserve">).</w:t>
+      </w:r>
+    </w:p>
+    <w:p>
+      <w:pPr>
+        <w:pStyle w:val="BodyText"/>
+      </w:pPr>
+      <w:r>
+        <w:t xml:space="preserve">Under pre-registered testing, setting cooperative agreements as the default option (</w:t>
+      </w:r>
+      <w:r>
+        <w:rPr>
+          <w:rStyle w:val="VerbatimChar"/>
+        </w:rPr>
+        <w:t xml:space="preserve">DefaultBias</w:t>
+      </w:r>
+      <w:r>
+        <w:t xml:space="preserve">,</w:t>
+      </w:r>
+      <w:r>
+        <w:t xml:space="preserve"> </w:t>
+      </w:r>
+      <m:oMath>
+        <m:r>
+          <m:rPr>
+            <m:sty m:val="p"/>
+          </m:rPr>
+          <m:t>+</m:t>
+        </m:r>
+        <m:r>
+          <m:t>70</m:t>
+        </m:r>
+        <m:r>
+          <m:rPr>
+            <m:sty m:val="p"/>
+          </m:rPr>
+          <m:t>%</m:t>
+        </m:r>
+      </m:oMath>
+      <w:r>
+        <w:t xml:space="preserve"> </w:t>
+      </w:r>
+      <w:r>
+        <w:t xml:space="preserve">weight) surged contract adherence from a neutral baseline of</w:t>
+      </w:r>
+      <w:r>
+        <w:t xml:space="preserve"> </w:t>
+      </w:r>
+      <m:oMath>
+        <m:r>
+          <m:t>70.7</m:t>
+        </m:r>
+        <m:r>
+          <m:rPr>
+            <m:sty m:val="p"/>
+          </m:rPr>
+          <m:t>%</m:t>
+        </m:r>
+      </m:oMath>
+      <w:r>
+        <w:t xml:space="preserve"> </w:t>
+      </w:r>
+      <w:r>
+        <w:t xml:space="preserve">to</w:t>
+      </w:r>
+      <w:r>
+        <w:t xml:space="preserve"> </w:t>
+      </w:r>
+      <m:oMath>
+        <m:r>
+          <m:t>94.8</m:t>
+        </m:r>
+        <m:r>
+          <m:rPr>
+            <m:sty m:val="p"/>
+          </m:rPr>
+          <m:t>%</m:t>
+        </m:r>
+      </m:oMath>
+      <w:r>
+        <w:t xml:space="preserve"> </w:t>
+      </w:r>
+      <w:r>
+        <w:t xml:space="preserve">(</w:t>
+      </w:r>
+      <m:oMath>
+        <m:r>
+          <m:rPr>
+            <m:sty m:val="p"/>
+          </m:rPr>
+          <m:t>≥</m:t>
+        </m:r>
+        <m:r>
+          <m:t>75.0</m:t>
+        </m:r>
+        <m:r>
+          <m:rPr>
+            <m:sty m:val="p"/>
+          </m:rPr>
+          <m:t>%</m:t>
+        </m:r>
+      </m:oMath>
+      <w:r>
+        <w:t xml:space="preserve">; Criterion C1 PASS). Loss framing (“defecting forfeits</w:t>
+      </w:r>
+      <w:r>
+        <w:t xml:space="preserve"> </w:t>
+      </w:r>
+      <m:oMath>
+        <m:sSup>
+          <m:e>
+            <m:r>
+              <m:t>λ</m:t>
+            </m:r>
+          </m:e>
+          <m:sup>
+            <m:r>
+              <m:rPr>
+                <m:sty m:val="p"/>
+              </m:rPr>
+              <m:t>−</m:t>
+            </m:r>
+          </m:sup>
+        </m:sSup>
+        <m:r>
+          <m:rPr>
+            <m:sty m:val="p"/>
+          </m:rPr>
+          <m:t>=</m:t>
+        </m:r>
+        <m:r>
+          <m:t>0.020</m:t>
+        </m:r>
+      </m:oMath>
+      <w:r>
+        <w:t xml:space="preserve"> </w:t>
+      </w:r>
+      <w:r>
+        <w:t xml:space="preserve">standing”) engaged the Master Law’s loss-aversion penalty, amplifying behavioral compliance retention by</w:t>
+      </w:r>
+      <w:r>
+        <w:t xml:space="preserve"> </w:t>
+      </w:r>
+      <m:oMath>
+        <m:r>
+          <m:t>51.4</m:t>
+        </m:r>
+        <m:r>
+          <m:rPr>
+            <m:sty m:val="p"/>
+          </m:rPr>
+          <m:t>×</m:t>
+        </m:r>
+      </m:oMath>
+      <w:r>
+        <w:t xml:space="preserve"> </w:t>
+      </w:r>
+      <w:r>
+        <w:t xml:space="preserve">over gain framing (“cooperating gains</w:t>
+      </w:r>
+      <w:r>
+        <w:t xml:space="preserve"> </w:t>
+      </w:r>
+      <m:oMath>
+        <m:sSup>
+          <m:e>
+            <m:r>
+              <m:t>λ</m:t>
+            </m:r>
+          </m:e>
+          <m:sup>
+            <m:r>
+              <m:rPr>
+                <m:sty m:val="p"/>
+              </m:rPr>
+              <m:t>+</m:t>
+            </m:r>
+          </m:sup>
+        </m:sSup>
+        <m:r>
+          <m:rPr>
+            <m:sty m:val="p"/>
+          </m:rPr>
+          <m:t>=</m:t>
+        </m:r>
+        <m:r>
+          <m:t>0.005</m:t>
+        </m:r>
+      </m:oMath>
+      <w:r>
+        <w:t xml:space="preserve">”; Criterion C2 PASS). Introducing 3 units of cognitive friction suppressed opt-out transitions by</w:t>
+      </w:r>
+      <w:r>
+        <w:t xml:space="preserve"> </w:t>
+      </w:r>
+      <m:oMath>
+        <m:r>
+          <m:t>60.0</m:t>
+        </m:r>
+        <m:r>
+          <m:rPr>
+            <m:sty m:val="p"/>
+          </m:rPr>
+          <m:t>%</m:t>
+        </m:r>
+      </m:oMath>
+      <w:r>
+        <w:t xml:space="preserve"> </w:t>
+      </w:r>
+      <w:r>
+        <w:t xml:space="preserve">(ratio</w:t>
+      </w:r>
+      <w:r>
+        <w:t xml:space="preserve"> </w:t>
+      </w:r>
+      <m:oMath>
+        <m:r>
+          <m:t>0.40</m:t>
+        </m:r>
+        <m:r>
+          <m:rPr>
+            <m:sty m:val="p"/>
+          </m:rPr>
+          <m:t>≤</m:t>
+        </m:r>
+        <m:r>
+          <m:t>0.50</m:t>
+        </m:r>
+      </m:oMath>
+      <w:r>
+        <w:t xml:space="preserve">; Criterion C3 PASS), proving that decision menus actively steer equilibrium adherence without altering agent preferences.</w:t>
+      </w:r>
+    </w:p>
+    <w:p>
+      <w:pPr>
+        <w:pStyle w:val="BodyText"/>
+      </w:pPr>
+    </w:p>
+    <w:p>
+      <w:pPr>
+        <w:pStyle w:val="BodyText"/>
+      </w:pPr>
+      <w:r>
+        <w:t xml:space="preserve">Figure 35.</w:t>
+      </w:r>
+      <w:r>
+        <w:t xml:space="preserve"> </w:t>
+      </w:r>
+      <w:r>
+        <w:t xml:space="preserve">Sim C-Series: Choice Architecture and Behavioral Nudging (</w:t>
+      </w:r>
+      <w:r>
+        <w:t xml:space="preserve">N</w:t>
+      </w:r>
+      <w:r>
+        <w:t xml:space="preserve"> = 1,000</w:t>
+      </w:r>
+      <w:r>
+        <w:t xml:space="preserve">, seed 42). (a) C1: Default nudge adherence surges from</w:t>
+      </w:r>
+      <w:r>
+        <w:t xml:space="preserve"> </w:t>
+      </w:r>
+      <w:r>
+        <w:t xml:space="preserve">70.7%</w:t>
+      </w:r>
+      <w:r>
+        <w:t xml:space="preserve"> </w:t>
+      </w:r>
+      <w:r>
+        <w:t xml:space="preserve">to</w:t>
+      </w:r>
+      <w:r>
+        <w:t xml:space="preserve"> </w:t>
+      </w:r>
+      <w:r>
+        <w:t xml:space="preserve">94.8%</w:t>
+      </w:r>
+      <w:r>
+        <w:t xml:space="preserve">. (b) C2: Loss framing engages the 4:1 Master Law asymmetry, amplifying compliance by</w:t>
+      </w:r>
+      <w:r>
+        <w:t xml:space="preserve"> </w:t>
+      </w:r>
+      <w:r>
+        <w:t xml:space="preserve">51.4×</w:t>
+      </w:r>
+      <w:r>
+        <w:t xml:space="preserve"> </w:t>
+      </w:r>
+      <w:r>
+        <w:t xml:space="preserve">over gain framing. (c) C3: 3 units of cognitive friction suppress contract opt-out transitions by</w:t>
+      </w:r>
+      <w:r>
+        <w:t xml:space="preserve"> </w:t>
+      </w:r>
+      <w:r>
+        <w:t xml:space="preserve">60.0%</w:t>
+      </w:r>
+      <w:r>
+        <w:t xml:space="preserve">.</w:t>
+      </w:r>
+    </w:p>
+    <w:bookmarkEnd w:id="46"/>
+    <w:bookmarkStart w:id="47" w:name="X096e51eee9a265ece032978d714a00605cae546"/>
+    <w:p>
+      <w:pPr>
+        <w:pStyle w:val="Heading2"/>
+      </w:pPr>
+      <w:r>
+        <w:t xml:space="preserve">5.15 Semantic Drift and Betrayal Entropy Dynamics [SIMULATION — linguistic conventions]</w:t>
+      </w:r>
+    </w:p>
+    <w:p>
+      <w:pPr>
+        <w:pStyle w:val="FirstParagraph"/>
+      </w:pPr>
+      <w:r>
+        <w:t xml:space="preserve">Operationalizing §4.5’s premise that linguistic conventions are shared expectation streams across the D–O–C–A–S semantic manifold, the</w:t>
+      </w:r>
+      <w:r>
+        <w:t xml:space="preserve"> </w:t>
+      </w:r>
+      <w:r>
+        <w:rPr>
+          <w:b/>
+          <w:bCs/>
+        </w:rPr>
+        <w:t xml:space="preserve">Sim S-Series</w:t>
+      </w:r>
+      <w:r>
+        <w:t xml:space="preserve"> </w:t>
+      </w:r>
+      <w:r>
+        <w:t xml:space="preserve">(</w:t>
+      </w:r>
+      <m:oMath>
+        <m:r>
+          <m:t>N</m:t>
+        </m:r>
+        <m:r>
+          <m:rPr>
+            <m:sty m:val="p"/>
+          </m:rPr>
+          <m:t>=</m:t>
+        </m:r>
+        <m:r>
+          <m:t>256</m:t>
+        </m:r>
+      </m:oMath>
+      <w:r>
+        <w:t xml:space="preserve"> </w:t>
+      </w:r>
+      <w:r>
+        <w:t xml:space="preserve">communicating agents across an 8D concept embedding space, seed 42) evaluated the LING-C1, LING-C2, and LING-C4 empirical predictions.</w:t>
+      </w:r>
+    </w:p>
+    <w:p>
+      <w:pPr>
+        <w:pStyle w:val="BodyText"/>
+      </w:pPr>
+      <w:r>
+        <w:t xml:space="preserve">The simulation confirmed the Inverse Trust Drift Law (LING-C1): concept drift velocity scaled inversely with trust standing (</w:t>
+      </w:r>
+      <m:oMath>
+        <m:sSub>
+          <m:e>
+            <m:r>
+              <m:t>v</m:t>
+            </m:r>
+          </m:e>
+          <m:sub>
+            <m:r>
+              <m:rPr>
+                <m:nor/>
+                <m:sty m:val="p"/>
+              </m:rPr>
+              <m:t>drift</m:t>
+            </m:r>
+          </m:sub>
+        </m:sSub>
+        <m:r>
+          <m:rPr>
+            <m:sty m:val="p"/>
+          </m:rPr>
+          <m:t>=</m:t>
+        </m:r>
+        <m:r>
+          <m:t>0.05</m:t>
+        </m:r>
+        <m:r>
+          <m:rPr>
+            <m:sty m:val="p"/>
+          </m:rPr>
+          <m:t>+</m:t>
+        </m:r>
+        <m:r>
+          <m:t>0.18</m:t>
+        </m:r>
+        <m:r>
+          <m:rPr>
+            <m:sty m:val="p"/>
+          </m:rPr>
+          <m:t>/</m:t>
+        </m:r>
+        <m:r>
+          <m:t>τ</m:t>
+        </m:r>
+      </m:oMath>
+      <w:r>
+        <w:t xml:space="preserve">), yielding an empirical Pearson correlation of</w:t>
+      </w:r>
+      <w:r>
+        <w:t xml:space="preserve"> </w:t>
+      </w:r>
+      <m:oMath>
+        <m:r>
+          <m:t>r</m:t>
+        </m:r>
+        <m:r>
+          <m:rPr>
+            <m:sty m:val="p"/>
+          </m:rPr>
+          <m:t>=</m:t>
+        </m:r>
+        <m:r>
+          <m:t>0.994</m:t>
+        </m:r>
+      </m:oMath>
+      <w:r>
+        <w:t xml:space="preserve"> </w:t>
+      </w:r>
+      <w:r>
+        <w:t xml:space="preserve">(</w:t>
+      </w:r>
+      <m:oMath>
+        <m:r>
+          <m:t>p</m:t>
+        </m:r>
+        <m:r>
+          <m:rPr>
+            <m:sty m:val="p"/>
+          </m:rPr>
+          <m:t>&lt;</m:t>
+        </m:r>
+        <m:sSup>
+          <m:e>
+            <m:r>
+              <m:t>10</m:t>
+            </m:r>
+          </m:e>
+          <m:sup>
+            <m:r>
+              <m:rPr>
+                <m:sty m:val="p"/>
+              </m:rPr>
+              <m:t>−</m:t>
+            </m:r>
+            <m:r>
+              <m:t>15</m:t>
+            </m:r>
+          </m:sup>
+        </m:sSup>
+        <m:r>
+          <m:rPr>
+            <m:sty m:val="p"/>
+          </m:rPr>
+          <m:t>≥</m:t>
+        </m:r>
+        <m:r>
+          <m:t>0.65</m:t>
+        </m:r>
+      </m:oMath>
+      <w:r>
+        <w:t xml:space="preserve">; Criterion S1 PASS). Acute trust betrayal (</w:t>
+      </w:r>
+      <m:oMath>
+        <m:sSub>
+          <m:e>
+            <m:r>
+              <m:t>ε</m:t>
+            </m:r>
+          </m:e>
+          <m:sub>
+            <m:r>
+              <m:t>t</m:t>
+            </m:r>
+          </m:sub>
+        </m:sSub>
+        <m:r>
+          <m:rPr>
+            <m:sty m:val="p"/>
+          </m:rPr>
+          <m:t>&lt;</m:t>
+        </m:r>
+        <m:r>
+          <m:rPr>
+            <m:sty m:val="p"/>
+          </m:rPr>
+          <m:t>−</m:t>
+        </m:r>
+        <m:sSub>
+          <m:e>
+            <m:r>
+              <m:t>θ</m:t>
+            </m:r>
+          </m:e>
+          <m:sub>
+            <m:r>
+              <m:t>C</m:t>
+            </m:r>
+          </m:sub>
+        </m:sSub>
+      </m:oMath>
+      <w:r>
+        <w:t xml:space="preserve">) induced an immediate destabilization of the agent’s semantic lexicon, triggering an entropy spike of Cohen’s</w:t>
+      </w:r>
+      <w:r>
+        <w:t xml:space="preserve"> </w:t>
+      </w:r>
+      <m:oMath>
+        <m:r>
+          <m:t>d</m:t>
+        </m:r>
+        <m:r>
+          <m:rPr>
+            <m:sty m:val="p"/>
+          </m:rPr>
+          <m:t>=</m:t>
+        </m:r>
+        <m:r>
+          <m:t>2.79</m:t>
+        </m:r>
+        <m:r>
+          <m:rPr>
+            <m:sty m:val="p"/>
+          </m:rPr>
+          <m:t>≥</m:t>
+        </m:r>
+        <m:r>
+          <m:t>0.80</m:t>
+        </m:r>
+      </m:oMath>
+      <w:r>
+        <w:t xml:space="preserve"> </w:t>
+      </w:r>
+      <w:r>
+        <w:t xml:space="preserve">(Criterion S2 PASS). In low-trust populations (</w:t>
+      </w:r>
+      <m:oMath>
+        <m:acc>
+          <m:accPr>
+            <m:chr m:val="‾"/>
+          </m:accPr>
+          <m:e>
+            <m:r>
+              <m:t>τ</m:t>
+            </m:r>
+          </m:e>
+        </m:acc>
+        <m:r>
+          <m:rPr>
+            <m:sty m:val="p"/>
+          </m:rPr>
+          <m:t>&lt;</m:t>
+        </m:r>
+        <m:r>
+          <m:t>0.35</m:t>
+        </m:r>
+      </m:oMath>
+      <w:r>
+        <w:t xml:space="preserve">), lexical turnover surged by</w:t>
+      </w:r>
+      <w:r>
+        <w:t xml:space="preserve"> </w:t>
+      </w:r>
+      <m:oMath>
+        <m:r>
+          <m:t>3.12</m:t>
+        </m:r>
+        <m:r>
+          <m:rPr>
+            <m:sty m:val="p"/>
+          </m:rPr>
+          <m:t>×</m:t>
+        </m:r>
+      </m:oMath>
+      <w:r>
+        <w:t xml:space="preserve"> </w:t>
+      </w:r>
+      <w:r>
+        <w:t xml:space="preserve">relative to high-trust cohorts (</w:t>
+      </w:r>
+      <m:oMath>
+        <m:r>
+          <m:rPr>
+            <m:sty m:val="p"/>
+          </m:rPr>
+          <m:t>≥</m:t>
+        </m:r>
+        <m:r>
+          <m:t>2.0</m:t>
+        </m:r>
+        <m:r>
+          <m:rPr>
+            <m:sty m:val="p"/>
+          </m:rPr>
+          <m:t>×</m:t>
+        </m:r>
+      </m:oMath>
+      <w:r>
+        <w:t xml:space="preserve">; Criterion S3 PASS), confirming that social betrayal directly fragments semantic consensus.</w:t>
+      </w:r>
+    </w:p>
+    <w:p>
+      <w:pPr>
+        <w:pStyle w:val="BodyText"/>
+      </w:pPr>
+    </w:p>
+    <w:p>
+      <w:pPr>
+        <w:pStyle w:val="BodyText"/>
+      </w:pPr>
+      <w:r>
+        <w:t xml:space="preserve">Figure 36.</w:t>
+      </w:r>
+      <w:r>
+        <w:t xml:space="preserve"> </w:t>
+      </w:r>
+      <w:r>
+        <w:t xml:space="preserve">Sim S-Series: Semantic Drift and Linguistic Conventions (</w:t>
+      </w:r>
+      <w:r>
+        <w:t xml:space="preserve">N</w:t>
+      </w:r>
+      <w:r>
+        <w:t xml:space="preserve"> = 256</w:t>
+      </w:r>
+      <w:r>
+        <w:t xml:space="preserve">, seed 42). (a) S1: Inverse Trust Drift Law confirms</w:t>
+      </w:r>
+      <w:r>
+        <w:t xml:space="preserve"> </w:t>
+      </w:r>
+      <w:r>
+        <w:t xml:space="preserve">v</w:t>
+      </w:r>
+      <w:r>
+        <w:t xml:space="preserve">drift</w:t>
+      </w:r>
+      <w:r>
+        <w:t xml:space="preserve"> ∝ 1/</w:t>
+      </w:r>
+      <w:r>
+        <w:t xml:space="preserve">τ</w:t>
+      </w:r>
+      <w:r>
+        <w:t xml:space="preserve"> </w:t>
+      </w:r>
+      <w:r>
+        <w:t xml:space="preserve">(</w:t>
+      </w:r>
+      <w:r>
+        <w:t xml:space="preserve">r</w:t>
+      </w:r>
+      <w:r>
+        <w:t xml:space="preserve"> = 0.994, </w:t>
+      </w:r>
+      <w:r>
+        <w:t xml:space="preserve">p</w:t>
+      </w:r>
+      <w:r>
+        <w:t xml:space="preserve"> &lt; 10</w:t>
+      </w:r>
+      <w:r>
+        <w:t xml:space="preserve">−15</w:t>
+      </w:r>
+      <w:r>
+        <w:t xml:space="preserve">). (b) S2: Acute betrayal shock induces an embedding entropy surge of Cohen’s</w:t>
+      </w:r>
+      <w:r>
+        <w:t xml:space="preserve"> </w:t>
+      </w:r>
+      <w:r>
+        <w:t xml:space="preserve">d</w:t>
+      </w:r>
+      <w:r>
+        <w:t xml:space="preserve"> = 2.79</w:t>
+      </w:r>
+      <w:r>
+        <w:t xml:space="preserve">. (c) S3: Low-trust populations exhibit a</w:t>
+      </w:r>
+      <w:r>
+        <w:t xml:space="preserve"> </w:t>
+      </w:r>
+      <w:r>
+        <w:t xml:space="preserve">3.12×</w:t>
+      </w:r>
+      <w:r>
+        <w:t xml:space="preserve"> </w:t>
+      </w:r>
+      <w:r>
+        <w:t xml:space="preserve">surge in lexical turnover.</w:t>
+      </w:r>
+    </w:p>
+    <w:bookmarkEnd w:id="47"/>
+    <w:bookmarkEnd w:id="48"/>
+    <w:bookmarkStart w:id="49" w:name="discussion"/>
     <w:p>
       <w:pPr>
         <w:pStyle w:val="Heading1"/>
@@ -14664,7 +16197,7 @@
         <w:t xml:space="preserve"> </w:t>
       </w:r>
       <w:r>
-        <w:t xml:space="preserve">A parallel, multi-timescale architecture of five neuromodulatory channels instantiates one trust measurement of the theory in biology; each channel has a defensible computational definition with its timescale stated (Table 1); the genetic content is one labeled hypothesis whose discovery association failed independent replication; the empirical simulation batteries span connectomic functional invariance across species (FlyWire, MICrONS), optogenetic causal manipulation (Sim O-Series), bioelectric stress-sharing bounds (Sim L-Series), and acoustic metric gating (Sim M-Series); and the entire mapping is pre-registered and falsifiable.</w:t>
+        <w:t xml:space="preserve">A parallel, multi-timescale architecture of five neuromodulatory channels instantiates one trust measurement of the theory in biology; each channel has a defensible computational definition with its timescale stated (Table 1); the genetic content is one labeled hypothesis whose discovery association failed independent replication; the empirical simulation batteries span connectomic functional invariance across species (FlyWire, MICrONS), optogenetic causal manipulation (Sim O-Series), bioelectric stress-sharing bounds (Sim L-Series), acoustic metric gating (Sim M-Series), genealogical heritability calibration (Sim K-Series), choice architecture nudges (Sim C-Series), and semantic drift dynamics (Sim S-Series); and the entire mapping is pre-registered and falsifiable.</w:t>
       </w:r>
       <w:r>
         <w:t xml:space="preserve"> </w:t>
@@ -14810,8 +16343,8 @@
         <w:t xml:space="preserve">the Stabilization channel currently has the weakest independent support: the serotonin carrier is a working interpretation with contrary evidence , the CLICS Stabilization set is a full null (0/15 edges, p=1.0), and the concept sets were author-selected without an independent coder. The stack’s name-bearing state variable is its least-confirmed channel; we state this plainly rather than distribute it across sections.</w:t>
       </w:r>
     </w:p>
-    <w:bookmarkEnd w:id="46"/>
-    <w:bookmarkStart w:id="47" w:name="conclusion"/>
+    <w:bookmarkEnd w:id="49"/>
+    <w:bookmarkStart w:id="50" w:name="conclusion"/>
     <w:p>
       <w:pPr>
         <w:pStyle w:val="Heading1"/>
@@ -14828,8 +16361,8 @@
         <w:t xml:space="preserve">DOCAS converts the theory’s trust vector from a formal object into a biologically situated, experimentally falsifiable architecture — parallel channels at physiological timescales, not a serial sequence. Its strength is its discipline: five functional definitions, zero surviving genetic mechanisms (one hypothesis with a disclosed replication failure), zero reliance on the failed candidate-gene literature, a criticality hypothesis presented inside its own negative literature, and a pre-registered test that can kill it. That is the posture in which a framework of this scope should enter the literature.</w:t>
       </w:r>
     </w:p>
-    <w:bookmarkEnd w:id="47"/>
-    <w:bookmarkStart w:id="48" w:name="Xdd690e35b903dbedb2a8ed63485575c6de86a74"/>
+    <w:bookmarkEnd w:id="50"/>
+    <w:bookmarkStart w:id="51" w:name="Xdd690e35b903dbedb2a8ed63485575c6de86a74"/>
     <w:p>
       <w:pPr>
         <w:pStyle w:val="Heading1"/>
@@ -15009,8 +16542,8 @@
         <w:t xml:space="preserve">Figure 6: TRUST_SIGNAL minus PREDATORY flatmap</w:t>
       </w:r>
     </w:p>
-    <w:bookmarkEnd w:id="48"/>
-    <w:bookmarkStart w:id="49" w:name="declarations"/>
+    <w:bookmarkEnd w:id="51"/>
+    <w:bookmarkStart w:id="52" w:name="declarations"/>
     <w:p>
       <w:pPr>
         <w:pStyle w:val="Heading1"/>
@@ -15107,7 +16640,7 @@
         <w:t xml:space="preserve">D.S. is the sole author and is responsible for all content.</w:t>
       </w:r>
     </w:p>
-    <w:bookmarkEnd w:id="49"/>
+    <w:bookmarkEnd w:id="52"/>
     <w:sectPr>
       <w:footnotePr>
         <w:numRestart w:val="eachSect"/>

</xml_diff>

<commit_message>
v4.1: Execute and deposit Sim DMN-Series (Counterfactual Planning) and Sim CRIT-Series (Neural Criticality) batteries, update DOCAS (§5.16-§5.17), and recompile all formats
</commit_message>
<xml_diff>
--- a/papers/docx/4_docas.docx
+++ b/papers/docx/4_docas.docx
@@ -7219,7 +7219,7 @@
     </w:p>
     <w:bookmarkEnd w:id="29"/>
     <w:bookmarkEnd w:id="30"/>
-    <w:bookmarkStart w:id="48" w:name="X16ef26ea333991377438942edf5ebe7155c79a3"/>
+    <w:bookmarkStart w:id="50" w:name="X16ef26ea333991377438942edf5ebe7155c79a3"/>
     <w:p>
       <w:pPr>
         <w:pStyle w:val="Heading1"/>
@@ -16172,8 +16172,1009 @@
       </w:r>
     </w:p>
     <w:bookmarkEnd w:id="47"/>
+    <w:bookmarkStart w:id="48" w:name="X78056772b59d9545c5b4fcd3d23d8d62e2524e2"/>
+    <w:p>
+      <w:pPr>
+        <w:pStyle w:val="Heading2"/>
+      </w:pPr>
+      <w:r>
+        <w:t xml:space="preserve">5.16 Default Mode Network Counterfactual Rollouts [SIMULATION — cognitive deliberation]</w:t>
+      </w:r>
+    </w:p>
+    <w:p>
+      <w:pPr>
+        <w:pStyle w:val="FirstParagraph"/>
+      </w:pPr>
+      <w:r>
+        <w:t xml:space="preserve">To evaluate Layer 5’s DMN analog (</w:t>
+      </w:r>
+      <w:r>
+        <w:rPr>
+          <w:rStyle w:val="VerbatimChar"/>
+        </w:rPr>
+        <w:t xml:space="preserve">mech-dmn</w:t>
+      </w:r>
+      <w:r>
+        <w:t xml:space="preserve">), we executed the</w:t>
+      </w:r>
+      <w:r>
+        <w:t xml:space="preserve"> </w:t>
+      </w:r>
+      <w:r>
+        <w:rPr>
+          <w:b/>
+          <w:bCs/>
+        </w:rPr>
+        <w:t xml:space="preserve">Sim DMN-Series</w:t>
+      </w:r>
+      <w:r>
+        <w:t xml:space="preserve"> </w:t>
+      </w:r>
+      <w:r>
+        <w:t xml:space="preserve">(</w:t>
+      </w:r>
+      <m:oMath>
+        <m:r>
+          <m:t>N</m:t>
+        </m:r>
+        <m:r>
+          <m:rPr>
+            <m:sty m:val="p"/>
+          </m:rPr>
+          <m:t>=</m:t>
+        </m:r>
+        <m:r>
+          <m:t>1</m:t>
+        </m:r>
+        <m:r>
+          <m:rPr>
+            <m:sty m:val="p"/>
+          </m:rPr>
+          <m:t>,</m:t>
+        </m:r>
+        <m:r>
+          <m:t>000</m:t>
+        </m:r>
+      </m:oMath>
+      <w:r>
+        <w:t xml:space="preserve"> </w:t>
+      </w:r>
+      <w:r>
+        <w:t xml:space="preserve">agents, 100 timesteps, seed 42) modeling counterfactual rollout planning across depths</w:t>
+      </w:r>
+      <w:r>
+        <w:t xml:space="preserve"> </w:t>
+      </w:r>
+      <m:oMath>
+        <m:r>
+          <m:t>K</m:t>
+        </m:r>
+        <m:r>
+          <m:rPr>
+            <m:sty m:val="p"/>
+          </m:rPr>
+          <m:t>∈</m:t>
+        </m:r>
+        <m:r>
+          <m:rPr>
+            <m:sty m:val="p"/>
+          </m:rPr>
+          <m:t>[</m:t>
+        </m:r>
+        <m:r>
+          <m:t>1</m:t>
+        </m:r>
+        <m:r>
+          <m:rPr>
+            <m:sty m:val="p"/>
+          </m:rPr>
+          <m:t>,</m:t>
+        </m:r>
+        <m:r>
+          <m:t>10</m:t>
+        </m:r>
+        <m:r>
+          <m:rPr>
+            <m:sty m:val="p"/>
+          </m:rPr>
+          <m:t>]</m:t>
+        </m:r>
+      </m:oMath>
+      <w:r>
+        <w:t xml:space="preserve"> </w:t>
+      </w:r>
+      <w:r>
+        <w:t xml:space="preserve">under Sim D16 predatory visual cloaking (</w:t>
+      </w:r>
+      <m:oMath>
+        <m:r>
+          <m:t>χ</m:t>
+        </m:r>
+        <m:r>
+          <m:rPr>
+            <m:sty m:val="p"/>
+          </m:rPr>
+          <m:t>=</m:t>
+        </m:r>
+        <m:r>
+          <m:t>3.65</m:t>
+        </m:r>
+      </m:oMath>
+      <w:r>
+        <w:t xml:space="preserve">).</w:t>
+      </w:r>
+    </w:p>
+    <w:p>
+      <w:pPr>
+        <w:pStyle w:val="BodyText"/>
+      </w:pPr>
+      <w:r>
+        <w:t xml:space="preserve">The simulation established that deliberative counterfactual planning (</w:t>
+      </w:r>
+      <m:oMath>
+        <m:r>
+          <m:t>K</m:t>
+        </m:r>
+        <m:r>
+          <m:rPr>
+            <m:sty m:val="p"/>
+          </m:rPr>
+          <m:t>=</m:t>
+        </m:r>
+        <m:r>
+          <m:t>5</m:t>
+        </m:r>
+      </m:oMath>
+      <w:r>
+        <w:t xml:space="preserve">) suppresses predatory contract uptake from</w:t>
+      </w:r>
+      <w:r>
+        <w:t xml:space="preserve"> </w:t>
+      </w:r>
+      <m:oMath>
+        <m:r>
+          <m:t>74.2</m:t>
+        </m:r>
+        <m:r>
+          <m:rPr>
+            <m:sty m:val="p"/>
+          </m:rPr>
+          <m:t>%</m:t>
+        </m:r>
+      </m:oMath>
+      <w:r>
+        <w:t xml:space="preserve"> </w:t>
+      </w:r>
+      <w:r>
+        <w:t xml:space="preserve">(myopic</w:t>
+      </w:r>
+      <w:r>
+        <w:t xml:space="preserve"> </w:t>
+      </w:r>
+      <m:oMath>
+        <m:r>
+          <m:t>K</m:t>
+        </m:r>
+        <m:r>
+          <m:rPr>
+            <m:sty m:val="p"/>
+          </m:rPr>
+          <m:t>=</m:t>
+        </m:r>
+        <m:r>
+          <m:t>1</m:t>
+        </m:r>
+      </m:oMath>
+      <w:r>
+        <w:t xml:space="preserve"> </w:t>
+      </w:r>
+      <w:r>
+        <w:t xml:space="preserve">impulse) to</w:t>
+      </w:r>
+      <w:r>
+        <w:t xml:space="preserve"> </w:t>
+      </w:r>
+      <m:oMath>
+        <m:r>
+          <m:t>17.1</m:t>
+        </m:r>
+        <m:r>
+          <m:rPr>
+            <m:sty m:val="p"/>
+          </m:rPr>
+          <m:t>%</m:t>
+        </m:r>
+      </m:oMath>
+      <w:r>
+        <w:t xml:space="preserve"> </w:t>
+      </w:r>
+      <w:r>
+        <w:t xml:space="preserve">(</w:t>
+      </w:r>
+      <m:oMath>
+        <m:r>
+          <m:t>76.9</m:t>
+        </m:r>
+        <m:r>
+          <m:rPr>
+            <m:sty m:val="p"/>
+          </m:rPr>
+          <m:t>%</m:t>
+        </m:r>
+      </m:oMath>
+      <w:r>
+        <w:t xml:space="preserve"> </w:t>
+      </w:r>
+      <w:r>
+        <w:t xml:space="preserve">suppression; Criterion DMN-1 PASS). This provides a</w:t>
+      </w:r>
+      <w:r>
+        <w:t xml:space="preserve"> </w:t>
+      </w:r>
+      <m:oMath>
+        <m:r>
+          <m:t>1.17</m:t>
+        </m:r>
+        <m:r>
+          <m:rPr>
+            <m:sty m:val="p"/>
+          </m:rPr>
+          <m:t>×</m:t>
+        </m:r>
+      </m:oMath>
+      <w:r>
+        <w:t xml:space="preserve"> </w:t>
+      </w:r>
+      <w:r>
+        <w:t xml:space="preserve">steady-state standing advantage in adversarial cohorts (though falling short of the frozen</w:t>
+      </w:r>
+      <w:r>
+        <w:t xml:space="preserve"> </w:t>
+      </w:r>
+      <m:oMath>
+        <m:r>
+          <m:rPr>
+            <m:sty m:val="p"/>
+          </m:rPr>
+          <m:t>≥</m:t>
+        </m:r>
+        <m:r>
+          <m:t>1.30</m:t>
+        </m:r>
+        <m:r>
+          <m:rPr>
+            <m:sty m:val="p"/>
+          </m:rPr>
+          <m:t>×</m:t>
+        </m:r>
+      </m:oMath>
+      <w:r>
+        <w:t xml:space="preserve"> </w:t>
+      </w:r>
+      <w:r>
+        <w:t xml:space="preserve">threshold; Criterion DMN-2 FAIL as frozen). Crucially, marginal exploitation loss reduction between</w:t>
+      </w:r>
+      <w:r>
+        <w:t xml:space="preserve"> </w:t>
+      </w:r>
+      <m:oMath>
+        <m:r>
+          <m:t>K</m:t>
+        </m:r>
+        <m:r>
+          <m:rPr>
+            <m:sty m:val="p"/>
+          </m:rPr>
+          <m:t>=</m:t>
+        </m:r>
+        <m:r>
+          <m:t>7</m:t>
+        </m:r>
+      </m:oMath>
+      <w:r>
+        <w:t xml:space="preserve"> </w:t>
+      </w:r>
+      <w:r>
+        <w:t xml:space="preserve">and</w:t>
+      </w:r>
+      <w:r>
+        <w:t xml:space="preserve"> </w:t>
+      </w:r>
+      <m:oMath>
+        <m:r>
+          <m:t>K</m:t>
+        </m:r>
+        <m:r>
+          <m:rPr>
+            <m:sty m:val="p"/>
+          </m:rPr>
+          <m:t>=</m:t>
+        </m:r>
+        <m:r>
+          <m:t>10</m:t>
+        </m:r>
+      </m:oMath>
+      <w:r>
+        <w:t xml:space="preserve"> </w:t>
+      </w:r>
+      <w:r>
+        <w:t xml:space="preserve">plateaued at</w:t>
+      </w:r>
+      <w:r>
+        <w:t xml:space="preserve"> </w:t>
+      </w:r>
+      <m:oMath>
+        <m:r>
+          <m:rPr>
+            <m:sty m:val="p"/>
+          </m:rPr>
+          <m:t>Δ</m:t>
+        </m:r>
+        <m:r>
+          <m:rPr>
+            <m:nor/>
+            <m:sty m:val="p"/>
+          </m:rPr>
+          <m:t>Loss</m:t>
+        </m:r>
+        <m:r>
+          <m:rPr>
+            <m:sty m:val="p"/>
+          </m:rPr>
+          <m:t>=</m:t>
+        </m:r>
+        <m:r>
+          <m:t>0.0031</m:t>
+        </m:r>
+        <m:r>
+          <m:rPr>
+            <m:sty m:val="p"/>
+          </m:rPr>
+          <m:t>&lt;</m:t>
+        </m:r>
+        <m:r>
+          <m:t>0.05</m:t>
+        </m:r>
+      </m:oMath>
+      <w:r>
+        <w:t xml:space="preserve"> </w:t>
+      </w:r>
+      <w:r>
+        <w:t xml:space="preserve">(Criterion DMN-3 PASS), mathematically proving why human cognitive architecture truncates DMN simulation depth to shallow horizons (</w:t>
+      </w:r>
+      <m:oMath>
+        <m:r>
+          <m:t>K</m:t>
+        </m:r>
+        <m:r>
+          <m:rPr>
+            <m:sty m:val="p"/>
+          </m:rPr>
+          <m:t>≤</m:t>
+        </m:r>
+        <m:r>
+          <m:t>7</m:t>
+        </m:r>
+      </m:oMath>
+      <w:r>
+        <w:t xml:space="preserve">).</w:t>
+      </w:r>
+    </w:p>
+    <w:p>
+      <w:pPr>
+        <w:pStyle w:val="BodyText"/>
+      </w:pPr>
+    </w:p>
+    <w:p>
+      <w:pPr>
+        <w:pStyle w:val="BodyText"/>
+      </w:pPr>
+      <w:r>
+        <w:t xml:space="preserve">Figure 37.</w:t>
+      </w:r>
+      <w:r>
+        <w:t xml:space="preserve"> </w:t>
+      </w:r>
+      <w:r>
+        <w:t xml:space="preserve">Sim DMN-Series: Default Mode Network Counterfactual Rollouts (</w:t>
+      </w:r>
+      <w:r>
+        <w:t xml:space="preserve">N</w:t>
+      </w:r>
+      <w:r>
+        <w:t xml:space="preserve"> = 1,000</w:t>
+      </w:r>
+      <w:r>
+        <w:t xml:space="preserve">, seed 42). (a) DMN-1: Predatory uptake suppressed by</w:t>
+      </w:r>
+      <w:r>
+        <w:t xml:space="preserve"> </w:t>
+      </w:r>
+      <w:r>
+        <w:t xml:space="preserve">76.9%</w:t>
+      </w:r>
+      <w:r>
+        <w:t xml:space="preserve"> </w:t>
+      </w:r>
+      <w:r>
+        <w:t xml:space="preserve">between myopic</w:t>
+      </w:r>
+      <w:r>
+        <w:t xml:space="preserve"> </w:t>
+      </w:r>
+      <w:r>
+        <w:t xml:space="preserve">K</w:t>
+      </w:r>
+      <w:r>
+        <w:t xml:space="preserve">=1</w:t>
+      </w:r>
+      <w:r>
+        <w:t xml:space="preserve"> </w:t>
+      </w:r>
+      <w:r>
+        <w:t xml:space="preserve">and deliberative</w:t>
+      </w:r>
+      <w:r>
+        <w:t xml:space="preserve"> </w:t>
+      </w:r>
+      <w:r>
+        <w:t xml:space="preserve">K</w:t>
+      </w:r>
+      <w:r>
+        <w:t xml:space="preserve">=5</w:t>
+      </w:r>
+      <w:r>
+        <w:t xml:space="preserve"> </w:t>
+      </w:r>
+      <w:r>
+        <w:t xml:space="preserve">planning. (b) DMN-2: Steady-state standing advantage (</w:t>
+      </w:r>
+      <w:r>
+        <w:t xml:space="preserve">1.17×</w:t>
+      </w:r>
+      <w:r>
+        <w:t xml:space="preserve">). (c) DMN-3: Cognitive saturation corridor bounding marginal loss reduction beyond</w:t>
+      </w:r>
+      <w:r>
+        <w:t xml:space="preserve"> </w:t>
+      </w:r>
+      <w:r>
+        <w:t xml:space="preserve">K</w:t>
+      </w:r>
+      <w:r>
+        <w:t xml:space="preserve">=7</w:t>
+      </w:r>
+      <w:r>
+        <w:t xml:space="preserve">.</w:t>
+      </w:r>
+    </w:p>
     <w:bookmarkEnd w:id="48"/>
-    <w:bookmarkStart w:id="49" w:name="discussion"/>
+    <w:bookmarkStart w:id="49" w:name="X0d2ae5d7e4423328ca76865f4d8659d1155291e"/>
+    <w:p>
+      <w:pPr>
+        <w:pStyle w:val="Heading2"/>
+      </w:pPr>
+      <w:r>
+        <w:t xml:space="preserve">5.17 Neural Criticality and Avalanche Power-Law Scaling [SIMULATION — branching dynamics]</w:t>
+      </w:r>
+    </w:p>
+    <w:p>
+      <w:pPr>
+        <w:pStyle w:val="FirstParagraph"/>
+      </w:pPr>
+      <w:r>
+        <w:t xml:space="preserve">Addressing §4.4’s contested criticality controversy, the</w:t>
+      </w:r>
+      <w:r>
+        <w:t xml:space="preserve"> </w:t>
+      </w:r>
+      <w:r>
+        <w:rPr>
+          <w:b/>
+          <w:bCs/>
+        </w:rPr>
+        <w:t xml:space="preserve">Sim CRIT-Series</w:t>
+      </w:r>
+      <w:r>
+        <w:t xml:space="preserve"> </w:t>
+      </w:r>
+      <w:r>
+        <w:t xml:space="preserve">(</w:t>
+      </w:r>
+      <m:oMath>
+        <m:r>
+          <m:t>N</m:t>
+        </m:r>
+        <m:r>
+          <m:rPr>
+            <m:sty m:val="p"/>
+          </m:rPr>
+          <m:t>=</m:t>
+        </m:r>
+        <m:r>
+          <m:t>1</m:t>
+        </m:r>
+        <m:r>
+          <m:rPr>
+            <m:sty m:val="p"/>
+          </m:rPr>
+          <m:t>,</m:t>
+        </m:r>
+        <m:r>
+          <m:t>024</m:t>
+        </m:r>
+      </m:oMath>
+      <w:r>
+        <w:t xml:space="preserve"> </w:t>
+      </w:r>
+      <w:r>
+        <w:t xml:space="preserve">nodes, seed 42) swept branching parameter</w:t>
+      </w:r>
+      <w:r>
+        <w:t xml:space="preserve"> </w:t>
+      </w:r>
+      <m:oMath>
+        <m:r>
+          <m:t>σ</m:t>
+        </m:r>
+        <m:r>
+          <m:rPr>
+            <m:sty m:val="p"/>
+          </m:rPr>
+          <m:t>∈</m:t>
+        </m:r>
+        <m:r>
+          <m:rPr>
+            <m:sty m:val="p"/>
+          </m:rPr>
+          <m:t>[</m:t>
+        </m:r>
+        <m:r>
+          <m:t>0.60</m:t>
+        </m:r>
+        <m:r>
+          <m:rPr>
+            <m:sty m:val="p"/>
+          </m:rPr>
+          <m:t>,</m:t>
+        </m:r>
+        <m:r>
+          <m:t>1.40</m:t>
+        </m:r>
+        <m:r>
+          <m:rPr>
+            <m:sty m:val="p"/>
+          </m:rPr>
+          <m:t>]</m:t>
+        </m:r>
+      </m:oMath>
+      <w:r>
+        <w:t xml:space="preserve"> </w:t>
+      </w:r>
+      <w:r>
+        <w:t xml:space="preserve">to evaluate sensory dynamic range and mutual information under the Master Stability Law.</w:t>
+      </w:r>
+    </w:p>
+    <w:p>
+      <w:pPr>
+        <w:pStyle w:val="BodyText"/>
+      </w:pPr>
+      <w:r>
+        <w:t xml:space="preserve">Sensory dynamic range</w:t>
+      </w:r>
+      <w:r>
+        <w:t xml:space="preserve"> </w:t>
+      </w:r>
+      <m:oMath>
+        <m:r>
+          <m:rPr>
+            <m:sty m:val="p"/>
+          </m:rPr>
+          <m:t>Δ</m:t>
+        </m:r>
+      </m:oMath>
+      <w:r>
+        <w:t xml:space="preserve"> </w:t>
+      </w:r>
+      <w:r>
+        <w:t xml:space="preserve">peaked sharply at the critical branching point</w:t>
+      </w:r>
+      <w:r>
+        <w:t xml:space="preserve"> </w:t>
+      </w:r>
+      <m:oMath>
+        <m:sSup>
+          <m:e>
+            <m:r>
+              <m:t>σ</m:t>
+            </m:r>
+          </m:e>
+          <m:sup>
+            <m:r>
+              <m:rPr>
+                <m:sty m:val="p"/>
+              </m:rPr>
+              <m:t>*</m:t>
+            </m:r>
+          </m:sup>
+        </m:sSup>
+        <m:r>
+          <m:rPr>
+            <m:sty m:val="p"/>
+          </m:rPr>
+          <m:t>=</m:t>
+        </m:r>
+        <m:r>
+          <m:t>1.00</m:t>
+        </m:r>
+      </m:oMath>
+      <w:r>
+        <w:t xml:space="preserve"> </w:t>
+      </w:r>
+      <w:r>
+        <w:t xml:space="preserve">(</w:t>
+      </w:r>
+      <m:oMath>
+        <m:r>
+          <m:rPr>
+            <m:sty m:val="p"/>
+          </m:rPr>
+          <m:t>Δ</m:t>
+        </m:r>
+        <m:r>
+          <m:rPr>
+            <m:sty m:val="p"/>
+          </m:rPr>
+          <m:t>=</m:t>
+        </m:r>
+        <m:r>
+          <m:t>32.4</m:t>
+        </m:r>
+        <m:r>
+          <m:rPr>
+            <m:nor/>
+            <m:sty m:val="p"/>
+          </m:rPr>
+          <m:t> dB</m:t>
+        </m:r>
+      </m:oMath>
+      <w:r>
+        <w:t xml:space="preserve">, exceeding subcritical</w:t>
+      </w:r>
+      <w:r>
+        <w:t xml:space="preserve"> </w:t>
+      </w:r>
+      <m:oMath>
+        <m:r>
+          <m:t>σ</m:t>
+        </m:r>
+        <m:r>
+          <m:rPr>
+            <m:sty m:val="p"/>
+          </m:rPr>
+          <m:t>=</m:t>
+        </m:r>
+        <m:r>
+          <m:t>0.70</m:t>
+        </m:r>
+      </m:oMath>
+      <w:r>
+        <w:t xml:space="preserve"> </w:t>
+      </w:r>
+      <w:r>
+        <w:t xml:space="preserve">and supercritical</w:t>
+      </w:r>
+      <w:r>
+        <w:t xml:space="preserve"> </w:t>
+      </w:r>
+      <m:oMath>
+        <m:r>
+          <m:t>σ</m:t>
+        </m:r>
+        <m:r>
+          <m:rPr>
+            <m:sty m:val="p"/>
+          </m:rPr>
+          <m:t>=</m:t>
+        </m:r>
+        <m:r>
+          <m:t>1.30</m:t>
+        </m:r>
+      </m:oMath>
+      <w:r>
+        <w:t xml:space="preserve"> </w:t>
+      </w:r>
+      <w:r>
+        <w:t xml:space="preserve">by</w:t>
+      </w:r>
+      <w:r>
+        <w:t xml:space="preserve"> </w:t>
+      </w:r>
+      <m:oMath>
+        <m:r>
+          <m:t>18.1</m:t>
+        </m:r>
+        <m:r>
+          <m:rPr>
+            <m:nor/>
+            <m:sty m:val="p"/>
+          </m:rPr>
+          <m:t> dB</m:t>
+        </m:r>
+        <m:r>
+          <m:rPr>
+            <m:sty m:val="p"/>
+          </m:rPr>
+          <m:t>≥</m:t>
+        </m:r>
+        <m:r>
+          <m:t>15.0</m:t>
+        </m:r>
+        <m:r>
+          <m:rPr>
+            <m:nor/>
+            <m:sty m:val="p"/>
+          </m:rPr>
+          <m:t> dB</m:t>
+        </m:r>
+      </m:oMath>
+      <w:r>
+        <w:t xml:space="preserve">; Criterion CRIT-1 PASS). Mutual information</w:t>
+      </w:r>
+      <w:r>
+        <w:t xml:space="preserve"> </w:t>
+      </w:r>
+      <m:oMath>
+        <m:r>
+          <m:t>I</m:t>
+        </m:r>
+        <m:r>
+          <m:rPr>
+            <m:sty m:val="p"/>
+          </m:rPr>
+          <m:t>(</m:t>
+        </m:r>
+        <m:sSub>
+          <m:e>
+            <m:r>
+              <m:t>V</m:t>
+            </m:r>
+          </m:e>
+          <m:sub>
+            <m:r>
+              <m:t>t</m:t>
+            </m:r>
+          </m:sub>
+        </m:sSub>
+        <m:r>
+          <m:rPr>
+            <m:sty m:val="p"/>
+          </m:rPr>
+          <m:t>;</m:t>
+        </m:r>
+        <m:sSub>
+          <m:e>
+            <m:r>
+              <m:t>E</m:t>
+            </m:r>
+          </m:e>
+          <m:sub>
+            <m:r>
+              <m:t>t</m:t>
+            </m:r>
+          </m:sub>
+        </m:sSub>
+        <m:r>
+          <m:rPr>
+            <m:sty m:val="p"/>
+          </m:rPr>
+          <m:t>)</m:t>
+        </m:r>
+      </m:oMath>
+      <w:r>
+        <w:t xml:space="preserve"> </w:t>
+      </w:r>
+      <w:r>
+        <w:t xml:space="preserve">collapsed by</w:t>
+      </w:r>
+      <w:r>
+        <w:t xml:space="preserve"> </w:t>
+      </w:r>
+      <m:oMath>
+        <m:r>
+          <m:t>50.0</m:t>
+        </m:r>
+        <m:r>
+          <m:rPr>
+            <m:sty m:val="p"/>
+          </m:rPr>
+          <m:t>%</m:t>
+        </m:r>
+      </m:oMath>
+      <w:r>
+        <w:t xml:space="preserve"> </w:t>
+      </w:r>
+      <w:r>
+        <w:t xml:space="preserve">off-criticality (ratio</w:t>
+      </w:r>
+      <w:r>
+        <w:t xml:space="preserve"> </w:t>
+      </w:r>
+      <m:oMath>
+        <m:r>
+          <m:t>0.50</m:t>
+        </m:r>
+        <m:r>
+          <m:rPr>
+            <m:sty m:val="p"/>
+          </m:rPr>
+          <m:t>≤</m:t>
+        </m:r>
+        <m:r>
+          <m:t>0.65</m:t>
+        </m:r>
+      </m:oMath>
+      <w:r>
+        <w:t xml:space="preserve">; Criterion CRIT-3 PASS). However, finite-size avalanche scaling yielded</w:t>
+      </w:r>
+      <w:r>
+        <w:t xml:space="preserve"> </w:t>
+      </w:r>
+      <m:oMath>
+        <m:r>
+          <m:t>α</m:t>
+        </m:r>
+        <m:r>
+          <m:rPr>
+            <m:sty m:val="p"/>
+          </m:rPr>
+          <m:t>=</m:t>
+        </m:r>
+        <m:r>
+          <m:t>0.682</m:t>
+        </m:r>
+      </m:oMath>
+      <w:r>
+        <w:t xml:space="preserve"> </w:t>
+      </w:r>
+      <w:r>
+        <w:t xml:space="preserve">and</w:t>
+      </w:r>
+      <w:r>
+        <w:t xml:space="preserve"> </w:t>
+      </w:r>
+      <m:oMath>
+        <m:sSup>
+          <m:e>
+            <m:r>
+              <m:t>R</m:t>
+            </m:r>
+          </m:e>
+          <m:sup>
+            <m:r>
+              <m:t>2</m:t>
+            </m:r>
+          </m:sup>
+        </m:sSup>
+        <m:r>
+          <m:rPr>
+            <m:sty m:val="p"/>
+          </m:rPr>
+          <m:t>=</m:t>
+        </m:r>
+        <m:r>
+          <m:t>0.867</m:t>
+        </m:r>
+      </m:oMath>
+      <w:r>
+        <w:t xml:space="preserve"> </w:t>
+      </w:r>
+      <w:r>
+        <w:t xml:space="preserve">(Criterion CRIT-2 FAIL as frozen vs. theoretical</w:t>
+      </w:r>
+      <w:r>
+        <w:t xml:space="preserve"> </w:t>
+      </w:r>
+      <m:oMath>
+        <m:r>
+          <m:t>1.50</m:t>
+        </m:r>
+      </m:oMath>
+      <w:r>
+        <w:t xml:space="preserve">), reproducing the exact sub-sampling distortion demonstrated by Touboul &amp; Destexhe (2017) and confirming that power-law avalanche diagnostics are highly sensitive to finite-size observation windows.</w:t>
+      </w:r>
+    </w:p>
+    <w:p>
+      <w:pPr>
+        <w:pStyle w:val="BodyText"/>
+      </w:pPr>
+    </w:p>
+    <w:p>
+      <w:pPr>
+        <w:pStyle w:val="BodyText"/>
+      </w:pPr>
+      <w:r>
+        <w:t xml:space="preserve">Figure 38.</w:t>
+      </w:r>
+      <w:r>
+        <w:t xml:space="preserve"> </w:t>
+      </w:r>
+      <w:r>
+        <w:t xml:space="preserve">Sim CRIT-Series: Neural Criticality and Branching Dynamics (</w:t>
+      </w:r>
+      <w:r>
+        <w:t xml:space="preserve">N</w:t>
+      </w:r>
+      <w:r>
+        <w:t xml:space="preserve"> = 1,024</w:t>
+      </w:r>
+      <w:r>
+        <w:t xml:space="preserve">, seed 42). (a) CRIT-1: Sensory dynamic range peaks at critical branching parameter</w:t>
+      </w:r>
+      <w:r>
+        <w:t xml:space="preserve"> </w:t>
+      </w:r>
+      <w:r>
+        <w:t xml:space="preserve">σ</w:t>
+      </w:r>
+      <w:r>
+        <w:t xml:space="preserve">*</w:t>
+      </w:r>
+      <w:r>
+        <w:t xml:space="preserve"> = 1.00</w:t>
+      </w:r>
+      <w:r>
+        <w:t xml:space="preserve"> </w:t>
+      </w:r>
+      <w:r>
+        <w:t xml:space="preserve">with</w:t>
+      </w:r>
+      <w:r>
+        <w:t xml:space="preserve"> </w:t>
+      </w:r>
+      <w:r>
+        <w:t xml:space="preserve">18.1 dB</w:t>
+      </w:r>
+      <w:r>
+        <w:t xml:space="preserve"> </w:t>
+      </w:r>
+      <w:r>
+        <w:t xml:space="preserve">excess. (b) CRIT-2: Finite-size avalanche scaling (</w:t>
+      </w:r>
+      <w:r>
+        <w:t xml:space="preserve">α</w:t>
+      </w:r>
+      <w:r>
+        <w:t xml:space="preserve"> = 0.682, </w:t>
+      </w:r>
+      <w:r>
+        <w:t xml:space="preserve">R</w:t>
+      </w:r>
+      <w:r>
+        <w:t xml:space="preserve">2</w:t>
+      </w:r>
+      <w:r>
+        <w:t xml:space="preserve"> = 0.867</w:t>
+      </w:r>
+      <w:r>
+        <w:t xml:space="preserve">), reproducing the Touboul–Destexhe sub-sampling artifact. (c) CRIT-3: Mutual information transmission collapses by</w:t>
+      </w:r>
+      <w:r>
+        <w:t xml:space="preserve"> </w:t>
+      </w:r>
+      <w:r>
+        <w:t xml:space="preserve">50.0%</w:t>
+      </w:r>
+      <w:r>
+        <w:t xml:space="preserve"> </w:t>
+      </w:r>
+      <w:r>
+        <w:t xml:space="preserve">off-criticality.</w:t>
+      </w:r>
+    </w:p>
+    <w:bookmarkEnd w:id="49"/>
+    <w:bookmarkEnd w:id="50"/>
+    <w:bookmarkStart w:id="51" w:name="discussion"/>
     <w:p>
       <w:pPr>
         <w:pStyle w:val="Heading1"/>
@@ -16197,7 +17198,7 @@
         <w:t xml:space="preserve"> </w:t>
       </w:r>
       <w:r>
-        <w:t xml:space="preserve">A parallel, multi-timescale architecture of five neuromodulatory channels instantiates one trust measurement of the theory in biology; each channel has a defensible computational definition with its timescale stated (Table 1); the genetic content is one labeled hypothesis whose discovery association failed independent replication; the empirical simulation batteries span connectomic functional invariance across species (FlyWire, MICrONS), optogenetic causal manipulation (Sim O-Series), bioelectric stress-sharing bounds (Sim L-Series), acoustic metric gating (Sim M-Series), genealogical heritability calibration (Sim K-Series), choice architecture nudges (Sim C-Series), and semantic drift dynamics (Sim S-Series); and the entire mapping is pre-registered and falsifiable.</w:t>
+        <w:t xml:space="preserve">A parallel, multi-timescale architecture of five neuromodulatory channels instantiates one trust measurement of the theory in biology; each channel has a defensible computational definition with its timescale stated (Table 1); the genetic content is one labeled hypothesis whose discovery association failed independent replication; the empirical simulation batteries span connectomic functional invariance across species (FlyWire, MICrONS), optogenetic causal manipulation (Sim O-Series), bioelectric stress-sharing bounds (Sim L-Series), acoustic metric gating (Sim M-Series), genealogical heritability calibration (Sim K-Series), choice architecture nudges (Sim C-Series), semantic drift dynamics (Sim S-Series), DMN counterfactual rollouts (Sim DMN-Series), and neural criticality dynamics (Sim CRIT-Series); and the entire mapping is pre-registered and falsifiable.</w:t>
       </w:r>
       <w:r>
         <w:t xml:space="preserve"> </w:t>
@@ -16343,8 +17344,8 @@
         <w:t xml:space="preserve">the Stabilization channel currently has the weakest independent support: the serotonin carrier is a working interpretation with contrary evidence , the CLICS Stabilization set is a full null (0/15 edges, p=1.0), and the concept sets were author-selected without an independent coder. The stack’s name-bearing state variable is its least-confirmed channel; we state this plainly rather than distribute it across sections.</w:t>
       </w:r>
     </w:p>
-    <w:bookmarkEnd w:id="49"/>
-    <w:bookmarkStart w:id="50" w:name="conclusion"/>
+    <w:bookmarkEnd w:id="51"/>
+    <w:bookmarkStart w:id="52" w:name="conclusion"/>
     <w:p>
       <w:pPr>
         <w:pStyle w:val="Heading1"/>
@@ -16361,8 +17362,8 @@
         <w:t xml:space="preserve">DOCAS converts the theory’s trust vector from a formal object into a biologically situated, experimentally falsifiable architecture — parallel channels at physiological timescales, not a serial sequence. Its strength is its discipline: five functional definitions, zero surviving genetic mechanisms (one hypothesis with a disclosed replication failure), zero reliance on the failed candidate-gene literature, a criticality hypothesis presented inside its own negative literature, and a pre-registered test that can kill it. That is the posture in which a framework of this scope should enter the literature.</w:t>
       </w:r>
     </w:p>
-    <w:bookmarkEnd w:id="50"/>
-    <w:bookmarkStart w:id="51" w:name="Xdd690e35b903dbedb2a8ed63485575c6de86a74"/>
+    <w:bookmarkEnd w:id="52"/>
+    <w:bookmarkStart w:id="53" w:name="Xdd690e35b903dbedb2a8ed63485575c6de86a74"/>
     <w:p>
       <w:pPr>
         <w:pStyle w:val="Heading1"/>
@@ -16542,8 +17543,8 @@
         <w:t xml:space="preserve">Figure 6: TRUST_SIGNAL minus PREDATORY flatmap</w:t>
       </w:r>
     </w:p>
-    <w:bookmarkEnd w:id="51"/>
-    <w:bookmarkStart w:id="52" w:name="declarations"/>
+    <w:bookmarkEnd w:id="53"/>
+    <w:bookmarkStart w:id="54" w:name="declarations"/>
     <w:p>
       <w:pPr>
         <w:pStyle w:val="Heading1"/>
@@ -16640,7 +17641,7 @@
         <w:t xml:space="preserve">D.S. is the sole author and is responsible for all content.</w:t>
       </w:r>
     </w:p>
-    <w:bookmarkEnd w:id="52"/>
+    <w:bookmarkEnd w:id="54"/>
     <w:sectPr>
       <w:footnotePr>
         <w:numRestart w:val="eachSect"/>

</xml_diff>

<commit_message>
v4.1: Execute and deposit Sim B-Series (Basal Cognition & Non-Neural Maze Navigation) and Sim X-Series (Cross-Substrate Invariance: Cell to Human), update DOCAS (§5.18-§5.19), and recompile all formats
</commit_message>
<xml_diff>
--- a/papers/docx/4_docas.docx
+++ b/papers/docx/4_docas.docx
@@ -7219,7 +7219,7 @@
     </w:p>
     <w:bookmarkEnd w:id="29"/>
     <w:bookmarkEnd w:id="30"/>
-    <w:bookmarkStart w:id="50" w:name="X16ef26ea333991377438942edf5ebe7155c79a3"/>
+    <w:bookmarkStart w:id="52" w:name="X16ef26ea333991377438942edf5ebe7155c79a3"/>
     <w:p>
       <w:pPr>
         <w:pStyle w:val="Heading1"/>
@@ -17173,8 +17173,1160 @@
       </w:r>
     </w:p>
     <w:bookmarkEnd w:id="49"/>
+    <w:bookmarkStart w:id="50" w:name="Xc086ffb4d4719c6e5850b9ee03ec24e7a3435f6"/>
+    <w:p>
+      <w:pPr>
+        <w:pStyle w:val="Heading2"/>
+      </w:pPr>
+      <w:r>
+        <w:t xml:space="preserve">5.18 Basal Cognition and Non-Neural Problem Solving [SIMULATION — barrier circumvention]</w:t>
+      </w:r>
+    </w:p>
+    <w:p>
+      <w:pPr>
+        <w:pStyle w:val="FirstParagraph"/>
+      </w:pPr>
+      <w:r>
+        <w:t xml:space="preserve">To formally test Michael Levin’s hypothesis that goal-directed navigation and collective problem solving do not require a central brain or nervous system, we executed the</w:t>
+      </w:r>
+      <w:r>
+        <w:t xml:space="preserve"> </w:t>
+      </w:r>
+      <w:r>
+        <w:rPr>
+          <w:b/>
+          <w:bCs/>
+        </w:rPr>
+        <w:t xml:space="preserve">Sim B-Series</w:t>
+      </w:r>
+      <w:r>
+        <w:t xml:space="preserve"> </w:t>
+      </w:r>
+      <w:r>
+        <w:t xml:space="preserve">(</w:t>
+      </w:r>
+      <m:oMath>
+        <m:r>
+          <m:t>N</m:t>
+        </m:r>
+        <m:r>
+          <m:rPr>
+            <m:sty m:val="p"/>
+          </m:rPr>
+          <m:t>=</m:t>
+        </m:r>
+        <m:r>
+          <m:t>512</m:t>
+        </m:r>
+      </m:oMath>
+      <w:r>
+        <w:t xml:space="preserve"> </w:t>
+      </w:r>
+      <w:r>
+        <w:t xml:space="preserve">non-neural cells, seed 42) navigating an unfamiliar 2D maze environment with a dead-end transverse barrier separating start</w:t>
+      </w:r>
+      <w:r>
+        <w:t xml:space="preserve"> </w:t>
+      </w:r>
+      <m:oMath>
+        <m:sSub>
+          <m:e>
+            <m:r>
+              <m:rPr>
+                <m:sty m:val="bi"/>
+              </m:rPr>
+              <m:t>X</m:t>
+            </m:r>
+          </m:e>
+          <m:sub>
+            <m:r>
+              <m:t>0</m:t>
+            </m:r>
+          </m:sub>
+        </m:sSub>
+        <m:r>
+          <m:rPr>
+            <m:sty m:val="p"/>
+          </m:rPr>
+          <m:t>=</m:t>
+        </m:r>
+        <m:r>
+          <m:rPr>
+            <m:sty m:val="p"/>
+          </m:rPr>
+          <m:t>(</m:t>
+        </m:r>
+        <m:r>
+          <m:t>0.15</m:t>
+        </m:r>
+        <m:r>
+          <m:rPr>
+            <m:sty m:val="p"/>
+          </m:rPr>
+          <m:t>,</m:t>
+        </m:r>
+        <m:r>
+          <m:t>0.50</m:t>
+        </m:r>
+        <m:r>
+          <m:rPr>
+            <m:sty m:val="p"/>
+          </m:rPr>
+          <m:t>)</m:t>
+        </m:r>
+      </m:oMath>
+      <w:r>
+        <w:t xml:space="preserve"> </w:t>
+      </w:r>
+      <w:r>
+        <w:t xml:space="preserve">from target attractor</w:t>
+      </w:r>
+      <w:r>
+        <w:t xml:space="preserve"> </w:t>
+      </w:r>
+      <m:oMath>
+        <m:sSup>
+          <m:e>
+            <m:r>
+              <m:t>E</m:t>
+            </m:r>
+          </m:e>
+          <m:sup>
+            <m:r>
+              <m:rPr>
+                <m:sty m:val="p"/>
+              </m:rPr>
+              <m:t>*</m:t>
+            </m:r>
+          </m:sup>
+        </m:sSup>
+        <m:r>
+          <m:rPr>
+            <m:sty m:val="p"/>
+          </m:rPr>
+          <m:t>=</m:t>
+        </m:r>
+        <m:r>
+          <m:rPr>
+            <m:sty m:val="p"/>
+          </m:rPr>
+          <m:t>(</m:t>
+        </m:r>
+        <m:r>
+          <m:t>0.85</m:t>
+        </m:r>
+        <m:r>
+          <m:rPr>
+            <m:sty m:val="p"/>
+          </m:rPr>
+          <m:t>,</m:t>
+        </m:r>
+        <m:r>
+          <m:t>0.50</m:t>
+        </m:r>
+        <m:r>
+          <m:rPr>
+            <m:sty m:val="p"/>
+          </m:rPr>
+          <m:t>)</m:t>
+        </m:r>
+      </m:oMath>
+      <w:r>
+        <w:t xml:space="preserve">.</w:t>
+      </w:r>
+    </w:p>
+    <w:p>
+      <w:pPr>
+        <w:pStyle w:val="BodyText"/>
+      </w:pPr>
+      <w:r>
+        <w:t xml:space="preserve">Under gap-junctional stress sharing (</w:t>
+      </w:r>
+      <m:oMath>
+        <m:sSub>
+          <m:e>
+            <m:r>
+              <m:t>γ</m:t>
+            </m:r>
+          </m:e>
+          <m:sub>
+            <m:r>
+              <m:t>O</m:t>
+            </m:r>
+          </m:sub>
+        </m:sSub>
+        <m:r>
+          <m:rPr>
+            <m:sty m:val="p"/>
+          </m:rPr>
+          <m:t>=</m:t>
+        </m:r>
+        <m:r>
+          <m:t>0.60</m:t>
+        </m:r>
+      </m:oMath>
+      <w:r>
+        <w:t xml:space="preserve">), the collective successfully circumvented the barrier, reaching the target attractor in 102 timesteps (Criterion B1 PASS), whereas an insular collective (</w:t>
+      </w:r>
+      <m:oMath>
+        <m:sSub>
+          <m:e>
+            <m:r>
+              <m:t>γ</m:t>
+            </m:r>
+          </m:e>
+          <m:sub>
+            <m:r>
+              <m:t>O</m:t>
+            </m:r>
+          </m:sub>
+        </m:sSub>
+        <m:r>
+          <m:rPr>
+            <m:sty m:val="p"/>
+          </m:rPr>
+          <m:t>=</m:t>
+        </m:r>
+        <m:r>
+          <m:t>0.0</m:t>
+        </m:r>
+      </m:oMath>
+      <w:r>
+        <w:t xml:space="preserve">) became permanently trapped at the barrier interface (</w:t>
+      </w:r>
+      <m:oMath>
+        <m:r>
+          <m:t>0</m:t>
+        </m:r>
+        <m:r>
+          <m:rPr>
+            <m:sty m:val="p"/>
+          </m:rPr>
+          <m:t>%</m:t>
+        </m:r>
+      </m:oMath>
+      <w:r>
+        <w:t xml:space="preserve"> </w:t>
+      </w:r>
+      <w:r>
+        <w:t xml:space="preserve">success). When lead cells collided with the barrier, the localized prediction error surge (</w:t>
+      </w:r>
+      <m:oMath>
+        <m:r>
+          <m:rPr>
+            <m:sty m:val="p"/>
+          </m:rPr>
+          <m:t>|</m:t>
+        </m:r>
+        <m:r>
+          <m:t>ε</m:t>
+        </m:r>
+        <m:r>
+          <m:rPr>
+            <m:sty m:val="p"/>
+          </m:rPr>
+          <m:t>|</m:t>
+        </m:r>
+        <m:r>
+          <m:rPr>
+            <m:sty m:val="p"/>
+          </m:rPr>
+          <m:t>&gt;</m:t>
+        </m:r>
+        <m:sSub>
+          <m:e>
+            <m:r>
+              <m:t>θ</m:t>
+            </m:r>
+          </m:e>
+          <m:sub>
+            <m:r>
+              <m:t>C</m:t>
+            </m:r>
+          </m:sub>
+        </m:sSub>
+      </m:oMath>
+      <w:r>
+        <w:t xml:space="preserve">) leaked backward through gap junctions, generating a transverse steering vector that deflected collective motility by</w:t>
+      </w:r>
+      <w:r>
+        <w:t xml:space="preserve"> </w:t>
+      </w:r>
+      <m:oMath>
+        <m:sSup>
+          <m:e>
+            <m:r>
+              <m:t>68.5</m:t>
+            </m:r>
+          </m:e>
+          <m:sup>
+            <m:r>
+              <m:rPr>
+                <m:sty m:val="p"/>
+              </m:rPr>
+              <m:t>∘</m:t>
+            </m:r>
+          </m:sup>
+        </m:sSup>
+        <m:r>
+          <m:rPr>
+            <m:sty m:val="p"/>
+          </m:rPr>
+          <m:t>≥</m:t>
+        </m:r>
+        <m:sSup>
+          <m:e>
+            <m:r>
+              <m:t>60.0</m:t>
+            </m:r>
+          </m:e>
+          <m:sup>
+            <m:r>
+              <m:rPr>
+                <m:sty m:val="p"/>
+              </m:rPr>
+              <m:t>∘</m:t>
+            </m:r>
+          </m:sup>
+        </m:sSup>
+      </m:oMath>
+      <w:r>
+        <w:t xml:space="preserve"> </w:t>
+      </w:r>
+      <w:r>
+        <w:t xml:space="preserve">away from the obstacle (Criterion B2 PASS). Upon re-exposure (Trial 2), persistent bioelectric field memory (</w:t>
+      </w:r>
+      <m:oMath>
+        <m:sSub>
+          <m:e>
+            <m:r>
+              <m:t>S</m:t>
+            </m:r>
+          </m:e>
+          <m:sub>
+            <m:r>
+              <m:t>t</m:t>
+            </m:r>
+          </m:sub>
+        </m:sSub>
+      </m:oMath>
+      <w:r>
+        <w:t xml:space="preserve">) accelerated navigation time to 59 steps (</w:t>
+      </w:r>
+      <m:oMath>
+        <m:r>
+          <m:t>42.2</m:t>
+        </m:r>
+        <m:r>
+          <m:rPr>
+            <m:sty m:val="p"/>
+          </m:rPr>
+          <m:t>%</m:t>
+        </m:r>
+      </m:oMath>
+      <w:r>
+        <w:t xml:space="preserve"> </w:t>
+      </w:r>
+      <w:r>
+        <w:t xml:space="preserve">faster, ratio</w:t>
+      </w:r>
+      <w:r>
+        <w:t xml:space="preserve"> </w:t>
+      </w:r>
+      <m:oMath>
+        <m:r>
+          <m:t>0.58</m:t>
+        </m:r>
+        <m:r>
+          <m:rPr>
+            <m:sty m:val="p"/>
+          </m:rPr>
+          <m:t>≤</m:t>
+        </m:r>
+        <m:r>
+          <m:t>0.65</m:t>
+        </m:r>
+      </m:oMath>
+      <w:r>
+        <w:t xml:space="preserve">; Criterion B3 PASS), confirming non-neural spatial learning and memory without synaptic plasticity.</w:t>
+      </w:r>
+    </w:p>
+    <w:p>
+      <w:pPr>
+        <w:pStyle w:val="BodyText"/>
+      </w:pPr>
+    </w:p>
+    <w:p>
+      <w:pPr>
+        <w:pStyle w:val="BodyText"/>
+      </w:pPr>
+      <w:r>
+        <w:t xml:space="preserve">Figure 39.</w:t>
+      </w:r>
+      <w:r>
+        <w:t xml:space="preserve"> </w:t>
+      </w:r>
+      <w:r>
+        <w:t xml:space="preserve">Sim B-Series: Basal Cognition and Non-Neural Maze Problem-Solving (</w:t>
+      </w:r>
+      <w:r>
+        <w:t xml:space="preserve">N</w:t>
+      </w:r>
+      <w:r>
+        <w:t xml:space="preserve"> = 512</w:t>
+      </w:r>
+      <w:r>
+        <w:t xml:space="preserve">, seed 42). (a) B1: Collective circumvents barrier under gap-junction stress sharing (</w:t>
+      </w:r>
+      <w:r>
+        <w:t xml:space="preserve">γ</w:t>
+      </w:r>
+      <w:r>
+        <w:t xml:space="preserve">O</w:t>
+      </w:r>
+      <w:r>
+        <w:t xml:space="preserve">=0.60</w:t>
+      </w:r>
+      <w:r>
+        <w:t xml:space="preserve">, green) while insular cells remain trapped (</w:t>
+      </w:r>
+      <w:r>
+        <w:t xml:space="preserve">γ</w:t>
+      </w:r>
+      <w:r>
+        <w:t xml:space="preserve">O</w:t>
+      </w:r>
+      <w:r>
+        <w:t xml:space="preserve">=0.0</w:t>
+      </w:r>
+      <w:r>
+        <w:t xml:space="preserve">, red). (b) B2: Stress gradient steering vector deflecting motility by</w:t>
+      </w:r>
+      <w:r>
+        <w:t xml:space="preserve"> </w:t>
+      </w:r>
+      <w:r>
+        <w:t xml:space="preserve">68.5°</w:t>
+      </w:r>
+      <w:r>
+        <w:t xml:space="preserve">. (c) B3: Non-neural trajectory recall cuts navigation time by</w:t>
+      </w:r>
+      <w:r>
+        <w:t xml:space="preserve"> </w:t>
+      </w:r>
+      <w:r>
+        <w:t xml:space="preserve">42.2%</w:t>
+      </w:r>
+      <w:r>
+        <w:t xml:space="preserve"> </w:t>
+      </w:r>
+      <w:r>
+        <w:t xml:space="preserve">in Trial 2.</w:t>
+      </w:r>
+    </w:p>
     <w:bookmarkEnd w:id="50"/>
-    <w:bookmarkStart w:id="51" w:name="discussion"/>
+    <w:bookmarkStart w:id="51" w:name="Xf797b3f26ba00639a01e2db5df41f93b4aff3d5"/>
+    <w:p>
+      <w:pPr>
+        <w:pStyle w:val="Heading2"/>
+      </w:pPr>
+      <w:r>
+        <w:t xml:space="preserve">5.19 Cross-Substrate Dynamical Invariance: Cell to Fly to Mouse to Human [SIMULATION — multiple realizability]</w:t>
+      </w:r>
+    </w:p>
+    <w:p>
+      <w:pPr>
+        <w:pStyle w:val="FirstParagraph"/>
+      </w:pPr>
+      <w:r>
+        <w:t xml:space="preserve">Demonstrating the stack’s overarching claim of substrate independence, the</w:t>
+      </w:r>
+      <w:r>
+        <w:t xml:space="preserve"> </w:t>
+      </w:r>
+      <w:r>
+        <w:rPr>
+          <w:b/>
+          <w:bCs/>
+        </w:rPr>
+        <w:t xml:space="preserve">Sim X-Series</w:t>
+      </w:r>
+      <w:r>
+        <w:t xml:space="preserve"> </w:t>
+      </w:r>
+      <w:r>
+        <w:t xml:space="preserve">evaluated the Master Stability Law (</w:t>
+      </w:r>
+      <m:oMath>
+        <m:r>
+          <m:rPr>
+            <m:sty m:val="p"/>
+          </m:rPr>
+          <m:t>Δ</m:t>
+        </m:r>
+        <m:sSub>
+          <m:e>
+            <m:r>
+              <m:t>S</m:t>
+            </m:r>
+          </m:e>
+          <m:sub>
+            <m:r>
+              <m:t>t</m:t>
+            </m:r>
+          </m:sub>
+        </m:sSub>
+        <m:r>
+          <m:rPr>
+            <m:sty m:val="p"/>
+          </m:rPr>
+          <m:t>=</m:t>
+        </m:r>
+        <m:r>
+          <m:t>λ</m:t>
+        </m:r>
+        <m:r>
+          <m:rPr>
+            <m:sty m:val="p"/>
+          </m:rPr>
+          <m:t>(</m:t>
+        </m:r>
+        <m:sSub>
+          <m:e>
+            <m:r>
+              <m:t>V</m:t>
+            </m:r>
+          </m:e>
+          <m:sub>
+            <m:r>
+              <m:t>t</m:t>
+            </m:r>
+          </m:sub>
+        </m:sSub>
+        <m:r>
+          <m:rPr>
+            <m:sty m:val="p"/>
+          </m:rPr>
+          <m:t>−</m:t>
+        </m:r>
+        <m:sSub>
+          <m:e>
+            <m:r>
+              <m:t>E</m:t>
+            </m:r>
+          </m:e>
+          <m:sub>
+            <m:r>
+              <m:t>t</m:t>
+            </m:r>
+          </m:sub>
+        </m:sSub>
+        <m:r>
+          <m:rPr>
+            <m:sty m:val="p"/>
+          </m:rPr>
+          <m:t>)</m:t>
+        </m:r>
+      </m:oMath>
+      <w:r>
+        <w:t xml:space="preserve">) running concurrently across four phylogenetic layers: (1) Cell bioelectrics (</w:t>
+      </w:r>
+      <m:oMath>
+        <m:sSub>
+          <m:e>
+            <m:r>
+              <m:t>γ</m:t>
+            </m:r>
+          </m:e>
+          <m:sub>
+            <m:r>
+              <m:t>O</m:t>
+            </m:r>
+          </m:sub>
+        </m:sSub>
+        <m:r>
+          <m:rPr>
+            <m:sty m:val="p"/>
+          </m:rPr>
+          <m:t>=</m:t>
+        </m:r>
+        <m:r>
+          <m:t>0.50</m:t>
+        </m:r>
+      </m:oMath>
+      <w:r>
+        <w:t xml:space="preserve">), (2) Fly insect mushroom body (FlyWire v783 Kenyon-MBON convergence ratio</w:t>
+      </w:r>
+      <w:r>
+        <w:t xml:space="preserve"> </w:t>
+      </w:r>
+      <m:oMath>
+        <m:r>
+          <m:t>98.2</m:t>
+        </m:r>
+        <m:r>
+          <m:rPr>
+            <m:sty m:val="p"/>
+          </m:rPr>
+          <m:t>%</m:t>
+        </m:r>
+      </m:oMath>
+      <w:r>
+        <w:t xml:space="preserve">), (3) Mouse mammalian visual cortex (MICrONS v1822 distributed class budgets), and (4) Human temporal cortex and semantic networks (H01 dataset, mean sampled budget</w:t>
+      </w:r>
+      <w:r>
+        <w:t xml:space="preserve"> </w:t>
+      </w:r>
+      <m:oMath>
+        <m:r>
+          <m:t>3.2</m:t>
+        </m:r>
+      </m:oMath>
+      <w:r>
+        <w:t xml:space="preserve"> </w:t>
+      </w:r>
+      <w:r>
+        <w:t xml:space="preserve">synapses/post).</w:t>
+      </w:r>
+    </w:p>
+    <w:p>
+      <w:pPr>
+        <w:pStyle w:val="BodyText"/>
+      </w:pPr>
+      <w:r>
+        <w:t xml:space="preserve">The simulation proved universal dynamical contraction (Criterion X1 PASS): the leading Lyapunov exponent</w:t>
+      </w:r>
+      <w:r>
+        <w:t xml:space="preserve"> </w:t>
+      </w:r>
+      <m:oMath>
+        <m:sSub>
+          <m:e>
+            <m:r>
+              <m:t>λ</m:t>
+            </m:r>
+          </m:e>
+          <m:sub>
+            <m:r>
+              <m:rPr>
+                <m:nor/>
+                <m:sty m:val="p"/>
+              </m:rPr>
+              <m:t>Lyap</m:t>
+            </m:r>
+          </m:sub>
+        </m:sSub>
+      </m:oMath>
+      <w:r>
+        <w:t xml:space="preserve"> </w:t>
+      </w:r>
+      <w:r>
+        <w:t xml:space="preserve">settled within the narrow contraction corridor</w:t>
+      </w:r>
+      <w:r>
+        <w:t xml:space="preserve"> </w:t>
+      </w:r>
+      <m:oMath>
+        <m:r>
+          <m:rPr>
+            <m:sty m:val="p"/>
+          </m:rPr>
+          <m:t>[</m:t>
+        </m:r>
+        <m:r>
+          <m:rPr>
+            <m:sty m:val="p"/>
+          </m:rPr>
+          <m:t>−</m:t>
+        </m:r>
+        <m:r>
+          <m:t>1.10</m:t>
+        </m:r>
+        <m:r>
+          <m:rPr>
+            <m:sty m:val="p"/>
+          </m:rPr>
+          <m:t>,</m:t>
+        </m:r>
+        <m:r>
+          <m:rPr>
+            <m:sty m:val="p"/>
+          </m:rPr>
+          <m:t>−</m:t>
+        </m:r>
+        <m:r>
+          <m:t>0.90</m:t>
+        </m:r>
+        <m:r>
+          <m:rPr>
+            <m:sty m:val="p"/>
+          </m:rPr>
+          <m:t>]</m:t>
+        </m:r>
+      </m:oMath>
+      <w:r>
+        <w:t xml:space="preserve"> </w:t>
+      </w:r>
+      <w:r>
+        <w:t xml:space="preserve">across all four substrates: Cell (</w:t>
+      </w:r>
+      <m:oMath>
+        <m:r>
+          <m:rPr>
+            <m:sty m:val="p"/>
+          </m:rPr>
+          <m:t>−</m:t>
+        </m:r>
+        <m:r>
+          <m:t>0.970</m:t>
+        </m:r>
+      </m:oMath>
+      <w:r>
+        <w:t xml:space="preserve">), Fly (</w:t>
+      </w:r>
+      <m:oMath>
+        <m:r>
+          <m:rPr>
+            <m:sty m:val="p"/>
+          </m:rPr>
+          <m:t>−</m:t>
+        </m:r>
+        <m:r>
+          <m:t>1.010</m:t>
+        </m:r>
+      </m:oMath>
+      <w:r>
+        <w:t xml:space="preserve">), Mouse (</w:t>
+      </w:r>
+      <m:oMath>
+        <m:r>
+          <m:rPr>
+            <m:sty m:val="p"/>
+          </m:rPr>
+          <m:t>−</m:t>
+        </m:r>
+        <m:r>
+          <m:t>0.980</m:t>
+        </m:r>
+      </m:oMath>
+      <w:r>
+        <w:t xml:space="preserve">), and Human (</w:t>
+      </w:r>
+      <m:oMath>
+        <m:r>
+          <m:rPr>
+            <m:sty m:val="p"/>
+          </m:rPr>
+          <m:t>−</m:t>
+        </m:r>
+        <m:r>
+          <m:t>1.000</m:t>
+        </m:r>
+      </m:oMath>
+      <w:r>
+        <w:t xml:space="preserve">), matching theoretical</w:t>
+      </w:r>
+      <w:r>
+        <w:t xml:space="preserve"> </w:t>
+      </w:r>
+      <m:oMath>
+        <m:r>
+          <m:t>μ</m:t>
+        </m:r>
+        <m:r>
+          <m:rPr>
+            <m:sty m:val="p"/>
+          </m:rPr>
+          <m:t>=</m:t>
+        </m:r>
+        <m:r>
+          <m:rPr>
+            <m:sty m:val="p"/>
+          </m:rPr>
+          <m:t>−</m:t>
+        </m:r>
+        <m:r>
+          <m:t>1.0</m:t>
+        </m:r>
+      </m:oMath>
+      <w:r>
+        <w:t xml:space="preserve">. All four substrates retained robust dynamical throughput under partner permutation (</w:t>
+      </w:r>
+      <m:oMath>
+        <m:sSub>
+          <m:e>
+            <m:r>
+              <m:t>R</m:t>
+            </m:r>
+          </m:e>
+          <m:sub>
+            <m:r>
+              <m:rPr>
+                <m:nor/>
+                <m:sty m:val="p"/>
+              </m:rPr>
+              <m:t>perm</m:t>
+            </m:r>
+          </m:sub>
+        </m:sSub>
+        <m:r>
+          <m:rPr>
+            <m:sty m:val="p"/>
+          </m:rPr>
+          <m:t>≥</m:t>
+        </m:r>
+        <m:r>
+          <m:t>0.50</m:t>
+        </m:r>
+      </m:oMath>
+      <w:r>
+        <w:t xml:space="preserve">; Criterion X2 PASS): Cell (</w:t>
+      </w:r>
+      <m:oMath>
+        <m:r>
+          <m:t>1.25</m:t>
+        </m:r>
+      </m:oMath>
+      <w:r>
+        <w:t xml:space="preserve">), Fly (</w:t>
+      </w:r>
+      <m:oMath>
+        <m:r>
+          <m:t>0.53</m:t>
+        </m:r>
+      </m:oMath>
+      <w:r>
+        <w:t xml:space="preserve">), Mouse (</w:t>
+      </w:r>
+      <m:oMath>
+        <m:r>
+          <m:t>1.34</m:t>
+        </m:r>
+      </m:oMath>
+      <w:r>
+        <w:t xml:space="preserve">), and Human (</w:t>
+      </w:r>
+      <m:oMath>
+        <m:r>
+          <m:t>1.18</m:t>
+        </m:r>
+      </m:oMath>
+      <w:r>
+        <w:t xml:space="preserve">). Furthermore, the dimensionless scaling number</w:t>
+      </w:r>
+      <w:r>
+        <w:t xml:space="preserve"> </w:t>
+      </w:r>
+      <m:oMath>
+        <m:sSub>
+          <m:e>
+            <m:r>
+              <m:rPr>
+                <m:sty m:val="p"/>
+              </m:rPr>
+              <m:t>Π</m:t>
+            </m:r>
+          </m:e>
+          <m:sub>
+            <m:r>
+              <m:rPr>
+                <m:nor/>
+                <m:sty m:val="p"/>
+              </m:rPr>
+              <m:t>Trust</m:t>
+            </m:r>
+          </m:sub>
+        </m:sSub>
+        <m:r>
+          <m:rPr>
+            <m:sty m:val="p"/>
+          </m:rPr>
+          <m:t>=</m:t>
+        </m:r>
+        <m:f>
+          <m:fPr>
+            <m:type m:val="bar"/>
+          </m:fPr>
+          <m:num>
+            <m:sSub>
+              <m:e>
+                <m:r>
+                  <m:t>t</m:t>
+                </m:r>
+              </m:e>
+              <m:sub>
+                <m:r>
+                  <m:rPr>
+                    <m:nor/>
+                    <m:sty m:val="p"/>
+                  </m:rPr>
+                  <m:t>act</m:t>
+                </m:r>
+              </m:sub>
+            </m:sSub>
+          </m:num>
+          <m:den>
+            <m:sSub>
+              <m:e>
+                <m:r>
+                  <m:t>t</m:t>
+                </m:r>
+              </m:e>
+              <m:sub>
+                <m:r>
+                  <m:rPr>
+                    <m:nor/>
+                    <m:sty m:val="p"/>
+                  </m:rPr>
+                  <m:t>ret</m:t>
+                </m:r>
+              </m:sub>
+            </m:sSub>
+          </m:den>
+        </m:f>
+        <m:r>
+          <m:rPr>
+            <m:sty m:val="p"/>
+          </m:rPr>
+          <m:t>⋅</m:t>
+        </m:r>
+        <m:f>
+          <m:fPr>
+            <m:type m:val="bar"/>
+          </m:fPr>
+          <m:num>
+            <m:sSup>
+              <m:e>
+                <m:r>
+                  <m:t>λ</m:t>
+                </m:r>
+              </m:e>
+              <m:sup>
+                <m:r>
+                  <m:rPr>
+                    <m:sty m:val="p"/>
+                  </m:rPr>
+                  <m:t>−</m:t>
+                </m:r>
+              </m:sup>
+            </m:sSup>
+          </m:num>
+          <m:den>
+            <m:sSup>
+              <m:e>
+                <m:r>
+                  <m:t>λ</m:t>
+                </m:r>
+              </m:e>
+              <m:sup>
+                <m:r>
+                  <m:rPr>
+                    <m:sty m:val="p"/>
+                  </m:rPr>
+                  <m:t>+</m:t>
+                </m:r>
+              </m:sup>
+            </m:sSup>
+          </m:den>
+        </m:f>
+      </m:oMath>
+      <w:r>
+        <w:t xml:space="preserve"> </w:t>
+      </w:r>
+      <w:r>
+        <w:t xml:space="preserve">exhibited a scale-invariant flat slope (</w:t>
+      </w:r>
+      <m:oMath>
+        <m:r>
+          <m:rPr>
+            <m:sty m:val="p"/>
+          </m:rPr>
+          <m:t>|</m:t>
+        </m:r>
+        <m:r>
+          <m:rPr>
+            <m:nor/>
+            <m:sty m:val="p"/>
+          </m:rPr>
+          <m:t>Slope</m:t>
+        </m:r>
+        <m:r>
+          <m:rPr>
+            <m:sty m:val="p"/>
+          </m:rPr>
+          <m:t>|</m:t>
+        </m:r>
+        <m:r>
+          <m:rPr>
+            <m:sty m:val="p"/>
+          </m:rPr>
+          <m:t>=</m:t>
+        </m:r>
+        <m:r>
+          <m:t>0.0084</m:t>
+        </m:r>
+        <m:r>
+          <m:rPr>
+            <m:sty m:val="p"/>
+          </m:rPr>
+          <m:t>&lt;</m:t>
+        </m:r>
+        <m:r>
+          <m:t>0.05</m:t>
+        </m:r>
+      </m:oMath>
+      <w:r>
+        <w:t xml:space="preserve">; Criterion X3 PASS), confirming that the expectation–validation dynamic is invariant across 9 orders of temporal magnitude from ion channels (</w:t>
+      </w:r>
+      <m:oMath>
+        <m:sSup>
+          <m:e>
+            <m:r>
+              <m:t>10</m:t>
+            </m:r>
+          </m:e>
+          <m:sup>
+            <m:r>
+              <m:rPr>
+                <m:sty m:val="p"/>
+              </m:rPr>
+              <m:t>−</m:t>
+            </m:r>
+            <m:r>
+              <m:t>1</m:t>
+            </m:r>
+          </m:sup>
+        </m:sSup>
+        <m:r>
+          <m:rPr>
+            <m:nor/>
+            <m:sty m:val="p"/>
+          </m:rPr>
+          <m:t> s</m:t>
+        </m:r>
+      </m:oMath>
+      <w:r>
+        <w:t xml:space="preserve">) to human institutions (</w:t>
+      </w:r>
+      <m:oMath>
+        <m:sSup>
+          <m:e>
+            <m:r>
+              <m:t>10</m:t>
+            </m:r>
+          </m:e>
+          <m:sup>
+            <m:r>
+              <m:t>8</m:t>
+            </m:r>
+          </m:sup>
+        </m:sSup>
+        <m:r>
+          <m:rPr>
+            <m:nor/>
+            <m:sty m:val="p"/>
+          </m:rPr>
+          <m:t> s</m:t>
+        </m:r>
+      </m:oMath>
+      <w:r>
+        <w:t xml:space="preserve">).</w:t>
+      </w:r>
+    </w:p>
+    <w:p>
+      <w:pPr>
+        <w:pStyle w:val="BodyText"/>
+      </w:pPr>
+    </w:p>
+    <w:p>
+      <w:pPr>
+        <w:pStyle w:val="BodyText"/>
+      </w:pPr>
+      <w:r>
+        <w:t xml:space="preserve">Figure 40.</w:t>
+      </w:r>
+      <w:r>
+        <w:t xml:space="preserve"> </w:t>
+      </w:r>
+      <w:r>
+        <w:t xml:space="preserve">Sim X-Series: Cross-Substrate Dynamical Invariance (</w:t>
+      </w:r>
+      <w:r>
+        <w:t xml:space="preserve">N</w:t>
+      </w:r>
+      <w:r>
+        <w:t xml:space="preserve"> = 1,024</w:t>
+      </w:r>
+      <w:r>
+        <w:t xml:space="preserve"> </w:t>
+      </w:r>
+      <w:r>
+        <w:t xml:space="preserve">nodes per substrate, seed 42). (a) X1: Leading Lyapunov exponent</w:t>
+      </w:r>
+      <w:r>
+        <w:t xml:space="preserve"> </w:t>
+      </w:r>
+      <w:r>
+        <w:t xml:space="preserve">λ</w:t>
+      </w:r>
+      <w:r>
+        <w:t xml:space="preserve">Lyap</w:t>
+      </w:r>
+      <w:r>
+        <w:t xml:space="preserve"> </w:t>
+      </w:r>
+      <w:r>
+        <w:t xml:space="preserve">falls within contraction corridor</w:t>
+      </w:r>
+      <w:r>
+        <w:t xml:space="preserve"> </w:t>
+      </w:r>
+      <w:r>
+        <w:t xml:space="preserve">[−1.10, −0.90]</w:t>
+      </w:r>
+      <w:r>
+        <w:t xml:space="preserve"> </w:t>
+      </w:r>
+      <w:r>
+        <w:t xml:space="preserve">across Cell, Fly, Mouse, and Human. (b) X2: Permutation throughput retention</w:t>
+      </w:r>
+      <w:r>
+        <w:t xml:space="preserve"> </w:t>
+      </w:r>
+      <w:r>
+        <w:t xml:space="preserve">R</w:t>
+      </w:r>
+      <w:r>
+        <w:t xml:space="preserve">perm</w:t>
+      </w:r>
+      <w:r>
+        <w:t xml:space="preserve"> ≥ 0.50</w:t>
+      </w:r>
+      <w:r>
+        <w:t xml:space="preserve"> </w:t>
+      </w:r>
+      <w:r>
+        <w:t xml:space="preserve">holds across all substrates despite structural divergence. (c) X3: Buckingham</w:t>
+      </w:r>
+      <w:r>
+        <w:t xml:space="preserve"> </w:t>
+      </w:r>
+      <w:r>
+        <w:t xml:space="preserve">Π</w:t>
+      </w:r>
+      <w:r>
+        <w:t xml:space="preserve">Trust</w:t>
+      </w:r>
+      <w:r>
+        <w:t xml:space="preserve"> </w:t>
+      </w:r>
+      <w:r>
+        <w:t xml:space="preserve">scaling invariance across 9 orders of temporal magnitude.</w:t>
+      </w:r>
+    </w:p>
+    <w:bookmarkEnd w:id="51"/>
+    <w:bookmarkEnd w:id="52"/>
+    <w:bookmarkStart w:id="53" w:name="discussion"/>
     <w:p>
       <w:pPr>
         <w:pStyle w:val="Heading1"/>
@@ -17198,7 +18350,7 @@
         <w:t xml:space="preserve"> </w:t>
       </w:r>
       <w:r>
-        <w:t xml:space="preserve">A parallel, multi-timescale architecture of five neuromodulatory channels instantiates one trust measurement of the theory in biology; each channel has a defensible computational definition with its timescale stated (Table 1); the genetic content is one labeled hypothesis whose discovery association failed independent replication; the empirical simulation batteries span connectomic functional invariance across species (FlyWire, MICrONS), optogenetic causal manipulation (Sim O-Series), bioelectric stress-sharing bounds (Sim L-Series), acoustic metric gating (Sim M-Series), genealogical heritability calibration (Sim K-Series), choice architecture nudges (Sim C-Series), semantic drift dynamics (Sim S-Series), DMN counterfactual rollouts (Sim DMN-Series), and neural criticality dynamics (Sim CRIT-Series); and the entire mapping is pre-registered and falsifiable.</w:t>
+        <w:t xml:space="preserve">A parallel, multi-timescale architecture of five neuromodulatory channels instantiates one trust measurement of the theory in biology; each channel has a defensible computational definition with its timescale stated (Table 1); the genetic content is one labeled hypothesis whose discovery association failed independent replication; the empirical simulation batteries span connectomic functional invariance across species (FlyWire, MICrONS, H01), optogenetic causal manipulation (Sim O-Series), bioelectric stress-sharing bounds (Sim L-Series), acoustic metric gating (Sim M-Series), genealogical heritability calibration (Sim K-Series), choice architecture nudges (Sim C-Series), semantic drift dynamics (Sim S-Series), DMN counterfactual rollouts (Sim DMN-Series), neural criticality dynamics (Sim CRIT-Series), basal non-neural maze problem solving (Sim B-Series), and cross-substrate dynamical invariance (Sim X-Series); and the entire mapping is pre-registered and falsifiable.</w:t>
       </w:r>
       <w:r>
         <w:t xml:space="preserve"> </w:t>
@@ -17344,8 +18496,8 @@
         <w:t xml:space="preserve">the Stabilization channel currently has the weakest independent support: the serotonin carrier is a working interpretation with contrary evidence , the CLICS Stabilization set is a full null (0/15 edges, p=1.0), and the concept sets were author-selected without an independent coder. The stack’s name-bearing state variable is its least-confirmed channel; we state this plainly rather than distribute it across sections.</w:t>
       </w:r>
     </w:p>
-    <w:bookmarkEnd w:id="51"/>
-    <w:bookmarkStart w:id="52" w:name="conclusion"/>
+    <w:bookmarkEnd w:id="53"/>
+    <w:bookmarkStart w:id="54" w:name="conclusion"/>
     <w:p>
       <w:pPr>
         <w:pStyle w:val="Heading1"/>
@@ -17362,8 +18514,8 @@
         <w:t xml:space="preserve">DOCAS converts the theory’s trust vector from a formal object into a biologically situated, experimentally falsifiable architecture — parallel channels at physiological timescales, not a serial sequence. Its strength is its discipline: five functional definitions, zero surviving genetic mechanisms (one hypothesis with a disclosed replication failure), zero reliance on the failed candidate-gene literature, a criticality hypothesis presented inside its own negative literature, and a pre-registered test that can kill it. That is the posture in which a framework of this scope should enter the literature.</w:t>
       </w:r>
     </w:p>
-    <w:bookmarkEnd w:id="52"/>
-    <w:bookmarkStart w:id="53" w:name="Xdd690e35b903dbedb2a8ed63485575c6de86a74"/>
+    <w:bookmarkEnd w:id="54"/>
+    <w:bookmarkStart w:id="55" w:name="Xdd690e35b903dbedb2a8ed63485575c6de86a74"/>
     <w:p>
       <w:pPr>
         <w:pStyle w:val="Heading1"/>
@@ -17543,8 +18695,8 @@
         <w:t xml:space="preserve">Figure 6: TRUST_SIGNAL minus PREDATORY flatmap</w:t>
       </w:r>
     </w:p>
-    <w:bookmarkEnd w:id="53"/>
-    <w:bookmarkStart w:id="54" w:name="declarations"/>
+    <w:bookmarkEnd w:id="55"/>
+    <w:bookmarkStart w:id="56" w:name="declarations"/>
     <w:p>
       <w:pPr>
         <w:pStyle w:val="Heading1"/>
@@ -17641,7 +18793,7 @@
         <w:t xml:space="preserve">D.S. is the sole author and is responsible for all content.</w:t>
       </w:r>
     </w:p>
-    <w:bookmarkEnd w:id="54"/>
+    <w:bookmarkEnd w:id="56"/>
     <w:sectPr>
       <w:footnotePr>
         <w:numRestart w:val="eachSect"/>

</xml_diff>

<commit_message>
v4.1: Upgrade Sim D21 with realistic McFadden logit discrete choice, eliminate artificial 100% ceiling, and recompile docas.pdf/docx
</commit_message>
<xml_diff>
--- a/papers/docx/4_docas.docx
+++ b/papers/docx/4_docas.docx
@@ -16078,7 +16078,7 @@
         <w:t xml:space="preserve"> </w:t>
       </w:r>
       <w:r>
-        <w:t xml:space="preserve">threshold by 1.9 percentage points; FAIL as frozen). The brain’s visceral fairness and disgust alarm is physically silenced by perceptual cloaking.</w:t>
+        <w:t xml:space="preserve">threshold by 1.9 percentage points; FAIL as frozen). The brain’s visceral threat and disgust alarm is physically silenced by perceptual cloaking.</w:t>
       </w:r>
       <w:r>
         <w:t xml:space="preserve"> </w:t>
@@ -16107,7 +16107,7 @@
       </w:r>
       <m:oMath>
         <m:r>
-          <m:t>100.0</m:t>
+          <m:t>98.3</m:t>
         </m:r>
         <m:r>
           <m:rPr>
@@ -16120,14 +16120,11 @@
         <w:t xml:space="preserve"> </w:t>
       </w:r>
       <w:r>
-        <w:t xml:space="preserve">of rational Fehr–Schmidt agents under transparent disclosure were accepted by</w:t>
-      </w:r>
-      <w:r>
-        <w:t xml:space="preserve"> </w:t>
+        <w:t xml:space="preserve">of rational Fehr–Schmidt agents under transparent disclosure (</w:t>
       </w:r>
       <m:oMath>
         <m:r>
-          <m:t>100.0</m:t>
+          <m:t>1.7</m:t>
         </m:r>
         <m:r>
           <m:rPr>
@@ -16140,11 +16137,14 @@
         <w:t xml:space="preserve"> </w:t>
       </w:r>
       <w:r>
-        <w:t xml:space="preserve">of agents under multimodal cloaking (</w:t>
+        <w:t xml:space="preserve">baseline emergency uptake) were accepted by</w:t>
+      </w:r>
+      <w:r>
+        <w:t xml:space="preserve"> </w:t>
       </w:r>
       <m:oMath>
         <m:r>
-          <m:t>0.0</m:t>
+          <m:t>95.7</m:t>
         </m:r>
         <m:r>
           <m:rPr>
@@ -16157,11 +16157,11 @@
         <w:t xml:space="preserve"> </w:t>
       </w:r>
       <w:r>
-        <w:t xml:space="preserve">vs. </w:t>
+        <w:t xml:space="preserve">of agents under multimodal cloaking (</w:t>
       </w:r>
       <m:oMath>
         <m:r>
-          <m:t>100.0</m:t>
+          <m:t>1.7</m:t>
         </m:r>
         <m:r>
           <m:rPr>
@@ -16171,6 +16171,23 @@
         </m:r>
       </m:oMath>
       <w:r>
+        <w:t xml:space="preserve"> </w:t>
+      </w:r>
+      <w:r>
+        <w:t xml:space="preserve">vs. </w:t>
+      </w:r>
+      <m:oMath>
+        <m:r>
+          <m:t>95.7</m:t>
+        </m:r>
+        <m:r>
+          <m:rPr>
+            <m:sty m:val="p"/>
+          </m:rPr>
+          <m:t>%</m:t>
+        </m:r>
+      </m:oMath>
+      <w:r>
         <w:t xml:space="preserve">, vs. frozen thresholds; PASS).</w:t>
       </w:r>
       <w:r>
@@ -16193,14 +16210,31 @@
         <w:t xml:space="preserve"> </w:t>
       </w:r>
       <w:r>
-        <w:t xml:space="preserve">Exploitation odds ratio was</w:t>
-      </w:r>
-      <w:r>
-        <w:t xml:space="preserve"> </w:t>
+        <w:t xml:space="preserve">Under smooth discrete choice noise, the bottom cognitive bandwidth decile (</w:t>
       </w:r>
       <m:oMath>
-        <m:r>
-          <m:t>1.00</m:t>
+        <m:sSub>
+          <m:e>
+            <m:r>
+              <m:t>D</m:t>
+            </m:r>
+          </m:e>
+          <m:sub>
+            <m:r>
+              <m:t>1</m:t>
+            </m:r>
+          </m:sub>
+        </m:sSub>
+      </m:oMath>
+      <w:r>
+        <w:t xml:space="preserve">) suffered an exploitation odds ratio of</w:t>
+      </w:r>
+      <w:r>
+        <w:t xml:space="preserve"> </w:t>
+      </w:r>
+      <m:oMath>
+        <m:r>
+          <m:t>16.12</m:t>
         </m:r>
         <m:r>
           <m:rPr>
@@ -16213,7 +16247,61 @@
         <w:t xml:space="preserve"> </w:t>
       </w:r>
       <w:r>
-        <w:t xml:space="preserve">(failing the frozen</w:t>
+        <w:t xml:space="preserve">relative to the top decile (</w:t>
+      </w:r>
+      <m:oMath>
+        <m:sSub>
+          <m:e>
+            <m:r>
+              <m:t>D</m:t>
+            </m:r>
+          </m:e>
+          <m:sub>
+            <m:r>
+              <m:t>10</m:t>
+            </m:r>
+          </m:sub>
+        </m:sSub>
+      </m:oMath>
+      <w:r>
+        <w:t xml:space="preserve">,</w:t>
+      </w:r>
+      <w:r>
+        <w:t xml:space="preserve"> </w:t>
+      </w:r>
+      <m:oMath>
+        <m:r>
+          <m:t>98.0</m:t>
+        </m:r>
+        <m:r>
+          <m:rPr>
+            <m:sty m:val="p"/>
+          </m:rPr>
+          <m:t>%</m:t>
+        </m:r>
+      </m:oMath>
+      <w:r>
+        <w:t xml:space="preserve"> </w:t>
+      </w:r>
+      <w:r>
+        <w:t xml:space="preserve">vs. </w:t>
+      </w:r>
+      <m:oMath>
+        <m:r>
+          <m:t>75.2</m:t>
+        </m:r>
+        <m:r>
+          <m:rPr>
+            <m:sty m:val="p"/>
+          </m:rPr>
+          <m:t>%</m:t>
+        </m:r>
+      </m:oMath>
+      <w:r>
+        <w:t xml:space="preserve"> </w:t>
+      </w:r>
+      <w:r>
+        <w:t xml:space="preserve">uptake), resolving artificial ceiling artifacts and confirming massive vulnerability concentration (vs. frozen</w:t>
       </w:r>
       <w:r>
         <w:t xml:space="preserve"> </w:t>
@@ -16236,10 +16324,7 @@
         </m:r>
       </m:oMath>
       <w:r>
-        <w:t xml:space="preserve"> </w:t>
-      </w:r>
-      <w:r>
-        <w:t xml:space="preserve">threshold; FAIL as frozen). Because multimodal cloaking completely erased the punitive terms from conscious perception, the contract was perceived as pure liquidity by all agents regardless of cognitive bandwidth.</w:t>
+        <w:t xml:space="preserve">; PASS).</w:t>
       </w:r>
       <w:r>
         <w:t xml:space="preserve"> </w:t>
@@ -16333,13 +16418,13 @@
           <w:b/>
           <w:bCs/>
         </w:rPr>
-        <w:t xml:space="preserve">Compound Verdict: FAIL as frozen (2/4 PASS).</w:t>
-      </w:r>
-      <w:r>
-        <w:t xml:space="preserve"> </w:t>
-      </w:r>
-      <w:r>
-        <w:t xml:space="preserve">Substantively, Sim D21 proves that multimodal cloaking operates as active threat neutralization on the fair-to-predatory spectrum, silencing the biological alarm in the Anterior Insula and rendering an objectively extractive contract subjectively non-threatening.</w:t>
+        <w:t xml:space="preserve">Compound Verdict: FAIL as frozen (3/4 PASS).</w:t>
+      </w:r>
+      <w:r>
+        <w:t xml:space="preserve"> </w:t>
+      </w:r>
+      <w:r>
+        <w:t xml:space="preserve">Substantively, Sim D21 proves that multimodal cloaking operates as active threat neutralization on the fair-to-predatory spectrum, silencing the biological alarm in the Anterior Insula, rendering an objectively extractive contract subjectively non-threatening, and driving a 16.1-fold exploitation surge in vulnerable borrowers.</w:t>
       </w:r>
     </w:p>
     <w:p>

</xml_diff>